<commit_message>
added prime roots algorithm
</commit_message>
<xml_diff>
--- a/Примеры работы алгоритмов.docx
+++ b/Примеры работы алгоритмов.docx
@@ -9,6 +9,10 @@
           <w:ilvl w:val="0"/>
           <w:numId w:val="1"/>
         </w:numPr>
+        <w:tabs>
+          <w:tab w:val="left" w:pos="1134"/>
+        </w:tabs>
+        <w:ind w:left="0" w:firstLine="709"/>
         <w:jc w:val="both"/>
         <w:rPr>
           <w:rFonts w:ascii="Times New Roman" w:hAnsi="Times New Roman" w:cs="Times New Roman"/>
@@ -28,17 +32,24 @@
     <w:p>
       <w:pPr>
         <w:pStyle w:val="a3"/>
+        <w:tabs>
+          <w:tab w:val="left" w:pos="1134"/>
+        </w:tabs>
+        <w:ind w:left="0" w:firstLine="709"/>
         <w:jc w:val="both"/>
         <w:rPr>
           <w:rFonts w:ascii="Times New Roman" w:hAnsi="Times New Roman" w:cs="Times New Roman"/>
           <w:sz w:val="28"/>
-          <w:lang w:val="en-US"/>
         </w:rPr>
       </w:pPr>
     </w:p>
     <w:p>
       <w:pPr>
         <w:pStyle w:val="a3"/>
+        <w:tabs>
+          <w:tab w:val="left" w:pos="1134"/>
+        </w:tabs>
+        <w:ind w:left="0" w:firstLine="709"/>
         <w:jc w:val="both"/>
         <w:rPr>
           <w:rFonts w:ascii="Times New Roman" w:hAnsi="Times New Roman" w:cs="Times New Roman"/>
@@ -1077,6 +1088,10 @@
           <w:ilvl w:val="0"/>
           <w:numId w:val="1"/>
         </w:numPr>
+        <w:tabs>
+          <w:tab w:val="left" w:pos="1134"/>
+        </w:tabs>
+        <w:ind w:left="0" w:firstLine="709"/>
         <w:jc w:val="both"/>
         <w:rPr>
           <w:rFonts w:ascii="Times New Roman" w:hAnsi="Times New Roman" w:cs="Times New Roman"/>
@@ -1097,6 +1112,10 @@
     <w:p>
       <w:pPr>
         <w:pStyle w:val="a3"/>
+        <w:tabs>
+          <w:tab w:val="left" w:pos="1134"/>
+        </w:tabs>
+        <w:ind w:left="0" w:firstLine="709"/>
         <w:jc w:val="both"/>
         <w:rPr>
           <w:rFonts w:ascii="Times New Roman" w:hAnsi="Times New Roman" w:cs="Times New Roman"/>
@@ -1107,6 +1126,10 @@
     <w:p>
       <w:pPr>
         <w:pStyle w:val="a3"/>
+        <w:tabs>
+          <w:tab w:val="left" w:pos="1134"/>
+        </w:tabs>
+        <w:ind w:left="0" w:firstLine="709"/>
         <w:jc w:val="both"/>
         <w:rPr>
           <w:rFonts w:ascii="Times New Roman" w:hAnsi="Times New Roman" w:cs="Times New Roman"/>
@@ -2502,6 +2525,10 @@
     <w:p>
       <w:pPr>
         <w:pStyle w:val="a3"/>
+        <w:tabs>
+          <w:tab w:val="left" w:pos="1134"/>
+        </w:tabs>
+        <w:ind w:left="0" w:firstLine="709"/>
         <w:jc w:val="both"/>
         <w:rPr>
           <w:rFonts w:ascii="Times New Roman" w:hAnsi="Times New Roman" w:cs="Times New Roman"/>
@@ -2531,6 +2558,10 @@
     <w:p>
       <w:pPr>
         <w:pStyle w:val="a3"/>
+        <w:tabs>
+          <w:tab w:val="left" w:pos="1134"/>
+        </w:tabs>
+        <w:ind w:left="0" w:firstLine="709"/>
         <w:jc w:val="both"/>
         <w:rPr>
           <w:rFonts w:ascii="Times New Roman" w:hAnsi="Times New Roman" w:cs="Times New Roman"/>
@@ -2550,6 +2581,10 @@
     <w:p>
       <w:pPr>
         <w:pStyle w:val="a3"/>
+        <w:tabs>
+          <w:tab w:val="left" w:pos="1134"/>
+        </w:tabs>
+        <w:ind w:left="0" w:firstLine="709"/>
         <w:jc w:val="both"/>
         <w:rPr>
           <w:rFonts w:ascii="Times New Roman" w:hAnsi="Times New Roman" w:cs="Times New Roman"/>
@@ -2561,6 +2596,10 @@
     <w:p>
       <w:pPr>
         <w:pStyle w:val="a3"/>
+        <w:tabs>
+          <w:tab w:val="left" w:pos="1134"/>
+        </w:tabs>
+        <w:ind w:left="0" w:firstLine="709"/>
         <w:jc w:val="both"/>
         <w:rPr>
           <w:rFonts w:ascii="Times New Roman" w:hAnsi="Times New Roman" w:cs="Times New Roman"/>
@@ -2611,11 +2650,14 @@
     <w:p>
       <w:pPr>
         <w:pStyle w:val="a3"/>
+        <w:tabs>
+          <w:tab w:val="left" w:pos="1134"/>
+        </w:tabs>
+        <w:ind w:left="0" w:firstLine="709"/>
         <w:jc w:val="both"/>
         <w:rPr>
           <w:rFonts w:ascii="Times New Roman" w:hAnsi="Times New Roman" w:cs="Times New Roman"/>
           <w:sz w:val="28"/>
-          <w:lang w:val="en-US"/>
         </w:rPr>
       </w:pPr>
       <w:r>
@@ -2636,6 +2678,2428 @@
         <w:t>=  1</w:t>
       </w:r>
       <w:proofErr w:type="gramEnd"/>
+    </w:p>
+    <w:p>
+      <w:pPr>
+        <w:rPr>
+          <w:rFonts w:ascii="Times New Roman" w:hAnsi="Times New Roman" w:cs="Times New Roman"/>
+          <w:sz w:val="28"/>
+        </w:rPr>
+      </w:pPr>
+      <w:r>
+        <w:rPr>
+          <w:rFonts w:ascii="Times New Roman" w:hAnsi="Times New Roman" w:cs="Times New Roman"/>
+          <w:sz w:val="28"/>
+        </w:rPr>
+        <w:br w:type="page"/>
+      </w:r>
+    </w:p>
+    <w:p>
+      <w:pPr>
+        <w:pStyle w:val="a3"/>
+        <w:numPr>
+          <w:ilvl w:val="0"/>
+          <w:numId w:val="1"/>
+        </w:numPr>
+        <w:tabs>
+          <w:tab w:val="left" w:pos="1134"/>
+        </w:tabs>
+        <w:ind w:left="0" w:firstLine="709"/>
+        <w:jc w:val="both"/>
+        <w:rPr>
+          <w:rFonts w:ascii="Times New Roman" w:hAnsi="Times New Roman" w:cs="Times New Roman"/>
+          <w:b/>
+          <w:sz w:val="28"/>
+          <w:szCs w:val="28"/>
+        </w:rPr>
+      </w:pPr>
+      <w:r>
+        <w:rPr>
+          <w:rFonts w:ascii="Times New Roman" w:hAnsi="Times New Roman" w:cs="Times New Roman"/>
+          <w:b/>
+          <w:sz w:val="28"/>
+          <w:szCs w:val="28"/>
+        </w:rPr>
+        <w:lastRenderedPageBreak/>
+        <w:t>Пример поиска всех первообразных корней по модулю</w:t>
+      </w:r>
+    </w:p>
+    <w:p>
+      <w:pPr>
+        <w:tabs>
+          <w:tab w:val="left" w:pos="1134"/>
+        </w:tabs>
+        <w:ind w:firstLine="709"/>
+        <w:jc w:val="both"/>
+        <w:rPr>
+          <w:rFonts w:ascii="Times New Roman" w:hAnsi="Times New Roman" w:cs="Times New Roman"/>
+          <w:sz w:val="28"/>
+          <w:szCs w:val="28"/>
+        </w:rPr>
+      </w:pPr>
+      <w:proofErr w:type="spellStart"/>
+      <w:r>
+        <w:rPr>
+          <w:rFonts w:ascii="Times New Roman" w:hAnsi="Times New Roman" w:cs="Times New Roman"/>
+          <w:sz w:val="28"/>
+          <w:szCs w:val="28"/>
+        </w:rPr>
+        <w:t>p</w:t>
+      </w:r>
+      <w:proofErr w:type="spellEnd"/>
+      <w:r>
+        <w:rPr>
+          <w:rFonts w:ascii="Times New Roman" w:hAnsi="Times New Roman" w:cs="Times New Roman"/>
+          <w:sz w:val="28"/>
+          <w:szCs w:val="28"/>
+        </w:rPr>
+        <w:t xml:space="preserve"> = 61</w:t>
+      </w:r>
+    </w:p>
+    <w:p>
+      <w:pPr>
+        <w:tabs>
+          <w:tab w:val="left" w:pos="1134"/>
+        </w:tabs>
+        <w:ind w:firstLine="709"/>
+        <w:jc w:val="both"/>
+        <w:rPr>
+          <w:rFonts w:ascii="Times New Roman" w:hAnsi="Times New Roman" w:cs="Times New Roman"/>
+          <w:sz w:val="28"/>
+          <w:szCs w:val="28"/>
+        </w:rPr>
+      </w:pPr>
+      <w:r>
+        <w:rPr>
+          <w:rFonts w:ascii="Times New Roman" w:hAnsi="Times New Roman" w:cs="Times New Roman"/>
+          <w:sz w:val="28"/>
+          <w:szCs w:val="28"/>
+        </w:rPr>
+        <w:t>Находим значение функции Эйлера:</w:t>
+      </w:r>
+    </w:p>
+    <w:p>
+      <w:pPr>
+        <w:tabs>
+          <w:tab w:val="left" w:pos="1134"/>
+        </w:tabs>
+        <w:ind w:firstLine="709"/>
+        <w:jc w:val="both"/>
+        <w:rPr>
+          <w:rFonts w:ascii="Times New Roman" w:hAnsi="Times New Roman" w:cs="Times New Roman"/>
+          <w:sz w:val="28"/>
+          <w:szCs w:val="28"/>
+        </w:rPr>
+      </w:pPr>
+      <w:proofErr w:type="spellStart"/>
+      <w:r>
+        <w:rPr>
+          <w:rFonts w:ascii="Times New Roman" w:hAnsi="Times New Roman" w:cs="Times New Roman"/>
+          <w:sz w:val="28"/>
+          <w:szCs w:val="28"/>
+        </w:rPr>
+        <w:t>phi</w:t>
+      </w:r>
+      <w:proofErr w:type="spellEnd"/>
+      <w:r>
+        <w:rPr>
+          <w:rFonts w:ascii="Times New Roman" w:hAnsi="Times New Roman" w:cs="Times New Roman"/>
+          <w:sz w:val="28"/>
+          <w:szCs w:val="28"/>
+        </w:rPr>
+        <w:t>(</w:t>
+      </w:r>
+      <w:proofErr w:type="spellStart"/>
+      <w:r>
+        <w:rPr>
+          <w:rFonts w:ascii="Times New Roman" w:hAnsi="Times New Roman" w:cs="Times New Roman"/>
+          <w:sz w:val="28"/>
+          <w:szCs w:val="28"/>
+        </w:rPr>
+        <w:t>p</w:t>
+      </w:r>
+      <w:proofErr w:type="spellEnd"/>
+      <w:r>
+        <w:rPr>
+          <w:rFonts w:ascii="Times New Roman" w:hAnsi="Times New Roman" w:cs="Times New Roman"/>
+          <w:sz w:val="28"/>
+          <w:szCs w:val="28"/>
+        </w:rPr>
+        <w:t xml:space="preserve">) = </w:t>
+      </w:r>
+      <w:proofErr w:type="spellStart"/>
+      <w:r>
+        <w:rPr>
+          <w:rFonts w:ascii="Times New Roman" w:hAnsi="Times New Roman" w:cs="Times New Roman"/>
+          <w:sz w:val="28"/>
+          <w:szCs w:val="28"/>
+        </w:rPr>
+        <w:t>p</w:t>
+      </w:r>
+      <w:proofErr w:type="spellEnd"/>
+      <w:r>
+        <w:rPr>
+          <w:rFonts w:ascii="Times New Roman" w:hAnsi="Times New Roman" w:cs="Times New Roman"/>
+          <w:sz w:val="28"/>
+          <w:szCs w:val="28"/>
+        </w:rPr>
+        <w:t xml:space="preserve"> - 1 = 61 - 1 = 60</w:t>
+      </w:r>
+      <w:r>
+        <w:rPr>
+          <w:rFonts w:ascii="Times New Roman" w:hAnsi="Times New Roman" w:cs="Times New Roman"/>
+          <w:sz w:val="28"/>
+          <w:szCs w:val="28"/>
+        </w:rPr>
+        <w:t>.</w:t>
+      </w:r>
+    </w:p>
+    <w:p>
+      <w:pPr>
+        <w:tabs>
+          <w:tab w:val="left" w:pos="1134"/>
+        </w:tabs>
+        <w:ind w:firstLine="709"/>
+        <w:jc w:val="both"/>
+        <w:rPr>
+          <w:rFonts w:ascii="Times New Roman" w:hAnsi="Times New Roman" w:cs="Times New Roman"/>
+          <w:sz w:val="28"/>
+          <w:szCs w:val="28"/>
+        </w:rPr>
+      </w:pPr>
+      <w:r>
+        <w:rPr>
+          <w:rFonts w:ascii="Times New Roman" w:hAnsi="Times New Roman" w:cs="Times New Roman"/>
+          <w:sz w:val="28"/>
+          <w:szCs w:val="28"/>
+        </w:rPr>
+        <w:t xml:space="preserve">Ищем простые делители </w:t>
+      </w:r>
+      <w:r>
+        <w:rPr>
+          <w:rFonts w:ascii="Times New Roman" w:hAnsi="Times New Roman" w:cs="Times New Roman"/>
+          <w:sz w:val="28"/>
+          <w:szCs w:val="28"/>
+          <w:lang w:val="en-US"/>
+        </w:rPr>
+        <w:t>phi</w:t>
+      </w:r>
+      <w:r>
+        <w:rPr>
+          <w:rFonts w:ascii="Times New Roman" w:hAnsi="Times New Roman" w:cs="Times New Roman"/>
+          <w:sz w:val="28"/>
+          <w:szCs w:val="28"/>
+        </w:rPr>
+        <w:t>(</w:t>
+      </w:r>
+      <w:proofErr w:type="spellStart"/>
+      <w:r>
+        <w:rPr>
+          <w:rFonts w:ascii="Times New Roman" w:hAnsi="Times New Roman" w:cs="Times New Roman"/>
+          <w:sz w:val="28"/>
+          <w:szCs w:val="28"/>
+        </w:rPr>
+        <w:t>p</w:t>
+      </w:r>
+      <w:proofErr w:type="spellEnd"/>
+      <w:r>
+        <w:rPr>
+          <w:rFonts w:ascii="Times New Roman" w:hAnsi="Times New Roman" w:cs="Times New Roman"/>
+          <w:sz w:val="28"/>
+          <w:szCs w:val="28"/>
+        </w:rPr>
+        <w:t>):</w:t>
+      </w:r>
+    </w:p>
+    <w:p>
+      <w:pPr>
+        <w:tabs>
+          <w:tab w:val="left" w:pos="1134"/>
+        </w:tabs>
+        <w:ind w:firstLine="709"/>
+        <w:jc w:val="both"/>
+        <w:rPr>
+          <w:rFonts w:ascii="Times New Roman" w:hAnsi="Times New Roman" w:cs="Times New Roman"/>
+          <w:sz w:val="28"/>
+          <w:szCs w:val="28"/>
+        </w:rPr>
+      </w:pPr>
+      <w:r>
+        <w:rPr>
+          <w:rFonts w:ascii="Times New Roman" w:hAnsi="Times New Roman" w:cs="Times New Roman"/>
+          <w:sz w:val="28"/>
+          <w:szCs w:val="28"/>
+        </w:rPr>
+        <w:t>60 = 2</w:t>
+      </w:r>
+      <w:r>
+        <w:rPr>
+          <w:rFonts w:ascii="Times New Roman" w:hAnsi="Times New Roman" w:cs="Times New Roman"/>
+          <w:sz w:val="28"/>
+          <w:szCs w:val="28"/>
+          <w:vertAlign w:val="superscript"/>
+        </w:rPr>
+        <w:t>2</w:t>
+      </w:r>
+      <w:r>
+        <w:rPr>
+          <w:rFonts w:ascii="Times New Roman" w:hAnsi="Times New Roman" w:cs="Times New Roman"/>
+          <w:sz w:val="28"/>
+          <w:szCs w:val="28"/>
+        </w:rPr>
+        <w:t xml:space="preserve"> *</w:t>
+      </w:r>
+      <w:r>
+        <w:rPr>
+          <w:rFonts w:ascii="Times New Roman" w:hAnsi="Times New Roman" w:cs="Times New Roman"/>
+          <w:sz w:val="28"/>
+          <w:szCs w:val="28"/>
+        </w:rPr>
+        <w:t xml:space="preserve"> 3 </w:t>
+      </w:r>
+      <w:r>
+        <w:rPr>
+          <w:rFonts w:ascii="Times New Roman" w:hAnsi="Times New Roman" w:cs="Times New Roman"/>
+          <w:sz w:val="28"/>
+          <w:szCs w:val="28"/>
+        </w:rPr>
+        <w:t>*</w:t>
+      </w:r>
+      <w:r>
+        <w:rPr>
+          <w:rFonts w:ascii="Times New Roman" w:hAnsi="Times New Roman" w:cs="Times New Roman"/>
+          <w:sz w:val="28"/>
+          <w:szCs w:val="28"/>
+        </w:rPr>
+        <w:t xml:space="preserve"> 5</w:t>
+      </w:r>
+      <w:r>
+        <w:rPr>
+          <w:rFonts w:ascii="Times New Roman" w:hAnsi="Times New Roman" w:cs="Times New Roman"/>
+          <w:sz w:val="28"/>
+          <w:szCs w:val="28"/>
+        </w:rPr>
+        <w:t>.</w:t>
+      </w:r>
+    </w:p>
+    <w:p>
+      <w:pPr>
+        <w:tabs>
+          <w:tab w:val="left" w:pos="1134"/>
+        </w:tabs>
+        <w:ind w:firstLine="709"/>
+        <w:jc w:val="both"/>
+        <w:rPr>
+          <w:rFonts w:ascii="Times New Roman" w:hAnsi="Times New Roman" w:cs="Times New Roman"/>
+          <w:sz w:val="28"/>
+          <w:szCs w:val="28"/>
+        </w:rPr>
+      </w:pPr>
+      <w:r>
+        <w:rPr>
+          <w:rFonts w:ascii="Times New Roman" w:hAnsi="Times New Roman" w:cs="Times New Roman"/>
+          <w:sz w:val="28"/>
+          <w:szCs w:val="28"/>
+        </w:rPr>
+        <w:t xml:space="preserve">Простые делители: </w:t>
+      </w:r>
+      <w:r>
+        <w:rPr>
+          <w:rFonts w:ascii="Times New Roman" w:hAnsi="Times New Roman" w:cs="Times New Roman"/>
+          <w:sz w:val="28"/>
+          <w:szCs w:val="28"/>
+        </w:rPr>
+        <w:t>2</w:t>
+      </w:r>
+      <w:r>
+        <w:rPr>
+          <w:rFonts w:ascii="Times New Roman" w:hAnsi="Times New Roman" w:cs="Times New Roman"/>
+          <w:sz w:val="28"/>
+          <w:szCs w:val="28"/>
+        </w:rPr>
+        <w:t xml:space="preserve">, </w:t>
+      </w:r>
+      <w:r>
+        <w:rPr>
+          <w:rFonts w:ascii="Times New Roman" w:hAnsi="Times New Roman" w:cs="Times New Roman"/>
+          <w:sz w:val="28"/>
+          <w:szCs w:val="28"/>
+        </w:rPr>
+        <w:t>3</w:t>
+      </w:r>
+      <w:r>
+        <w:rPr>
+          <w:rFonts w:ascii="Times New Roman" w:hAnsi="Times New Roman" w:cs="Times New Roman"/>
+          <w:sz w:val="28"/>
+          <w:szCs w:val="28"/>
+        </w:rPr>
+        <w:t>, 5.</w:t>
+      </w:r>
+    </w:p>
+    <w:p>
+      <w:pPr>
+        <w:tabs>
+          <w:tab w:val="left" w:pos="1134"/>
+        </w:tabs>
+        <w:ind w:firstLine="709"/>
+        <w:jc w:val="both"/>
+        <w:rPr>
+          <w:rFonts w:ascii="Times New Roman" w:hAnsi="Times New Roman" w:cs="Times New Roman"/>
+          <w:sz w:val="28"/>
+          <w:szCs w:val="28"/>
+        </w:rPr>
+      </w:pPr>
+      <w:r>
+        <w:rPr>
+          <w:rFonts w:ascii="Times New Roman" w:hAnsi="Times New Roman" w:cs="Times New Roman"/>
+          <w:sz w:val="28"/>
+          <w:szCs w:val="28"/>
+        </w:rPr>
+        <w:t>Проверяем, является ли 2 первообразным корнем по модулю 61:</w:t>
+      </w:r>
+    </w:p>
+    <w:p>
+      <w:pPr>
+        <w:tabs>
+          <w:tab w:val="left" w:pos="1134"/>
+        </w:tabs>
+        <w:ind w:firstLine="709"/>
+        <w:jc w:val="both"/>
+        <w:rPr>
+          <w:rFonts w:ascii="Times New Roman" w:hAnsi="Times New Roman" w:cs="Times New Roman"/>
+          <w:sz w:val="28"/>
+          <w:szCs w:val="28"/>
+        </w:rPr>
+      </w:pPr>
+      <w:r>
+        <w:rPr>
+          <w:rFonts w:ascii="Times New Roman" w:hAnsi="Times New Roman" w:cs="Times New Roman"/>
+          <w:sz w:val="28"/>
+          <w:szCs w:val="28"/>
+        </w:rPr>
+        <w:t xml:space="preserve">Для этого число должно удовлетворять условию: </w:t>
+      </w:r>
+      <w:proofErr w:type="spellStart"/>
+      <w:r>
+        <w:rPr>
+          <w:rFonts w:ascii="Times New Roman" w:hAnsi="Times New Roman" w:cs="Times New Roman"/>
+          <w:sz w:val="28"/>
+          <w:szCs w:val="28"/>
+        </w:rPr>
+        <w:t>g</w:t>
+      </w:r>
+      <w:proofErr w:type="spellEnd"/>
+      <w:r>
+        <w:rPr>
+          <w:rFonts w:ascii="Times New Roman" w:hAnsi="Times New Roman" w:cs="Times New Roman"/>
+          <w:sz w:val="28"/>
+          <w:szCs w:val="28"/>
+          <w:vertAlign w:val="superscript"/>
+          <w:lang w:val="en-US"/>
+        </w:rPr>
+        <w:t>phi</w:t>
+      </w:r>
+      <w:r>
+        <w:rPr>
+          <w:rFonts w:ascii="Times New Roman" w:hAnsi="Times New Roman" w:cs="Times New Roman"/>
+          <w:sz w:val="28"/>
+          <w:szCs w:val="28"/>
+          <w:vertAlign w:val="superscript"/>
+        </w:rPr>
+        <w:t>(</w:t>
+      </w:r>
+      <w:proofErr w:type="spellStart"/>
+      <w:r>
+        <w:rPr>
+          <w:rFonts w:ascii="Times New Roman" w:hAnsi="Times New Roman" w:cs="Times New Roman"/>
+          <w:sz w:val="28"/>
+          <w:szCs w:val="28"/>
+          <w:vertAlign w:val="superscript"/>
+        </w:rPr>
+        <w:t>p</w:t>
+      </w:r>
+      <w:proofErr w:type="spellEnd"/>
+      <w:r>
+        <w:rPr>
+          <w:rFonts w:ascii="Times New Roman" w:hAnsi="Times New Roman" w:cs="Times New Roman"/>
+          <w:sz w:val="28"/>
+          <w:szCs w:val="28"/>
+          <w:vertAlign w:val="superscript"/>
+        </w:rPr>
+        <w:t>)/</w:t>
+      </w:r>
+      <w:proofErr w:type="spellStart"/>
+      <w:r>
+        <w:rPr>
+          <w:rFonts w:ascii="Times New Roman" w:hAnsi="Times New Roman" w:cs="Times New Roman"/>
+          <w:sz w:val="28"/>
+          <w:szCs w:val="28"/>
+          <w:vertAlign w:val="superscript"/>
+        </w:rPr>
+        <w:t>q</w:t>
+      </w:r>
+      <w:r>
+        <w:rPr>
+          <w:rFonts w:ascii="Times New Roman" w:hAnsi="Times New Roman" w:cs="Times New Roman"/>
+          <w:sz w:val="28"/>
+          <w:szCs w:val="28"/>
+          <w:vertAlign w:val="subscript"/>
+        </w:rPr>
+        <w:t>i</w:t>
+      </w:r>
+      <w:proofErr w:type="spellEnd"/>
+      <w:r>
+        <w:rPr>
+          <w:rFonts w:ascii="Times New Roman" w:hAnsi="Times New Roman" w:cs="Times New Roman"/>
+          <w:sz w:val="28"/>
+          <w:szCs w:val="28"/>
+        </w:rPr>
+        <w:t xml:space="preserve"> </w:t>
+      </w:r>
+      <w:proofErr w:type="spellStart"/>
+      <w:r>
+        <w:rPr>
+          <w:rFonts w:ascii="Times New Roman" w:hAnsi="Times New Roman" w:cs="Times New Roman"/>
+          <w:sz w:val="28"/>
+          <w:szCs w:val="28"/>
+        </w:rPr>
+        <w:t>mod</w:t>
+      </w:r>
+      <w:proofErr w:type="spellEnd"/>
+      <w:r>
+        <w:rPr>
+          <w:rFonts w:ascii="Times New Roman" w:hAnsi="Times New Roman" w:cs="Times New Roman"/>
+          <w:sz w:val="28"/>
+          <w:szCs w:val="28"/>
+        </w:rPr>
+        <w:t xml:space="preserve"> </w:t>
+      </w:r>
+      <w:proofErr w:type="spellStart"/>
+      <w:r>
+        <w:rPr>
+          <w:rFonts w:ascii="Times New Roman" w:hAnsi="Times New Roman" w:cs="Times New Roman"/>
+          <w:sz w:val="28"/>
+          <w:szCs w:val="28"/>
+        </w:rPr>
+        <w:t>p</w:t>
+      </w:r>
+      <w:proofErr w:type="spellEnd"/>
+      <w:r>
+        <w:rPr>
+          <w:rFonts w:ascii="Times New Roman" w:hAnsi="Times New Roman" w:cs="Times New Roman"/>
+          <w:sz w:val="28"/>
+          <w:szCs w:val="28"/>
+        </w:rPr>
+        <w:t xml:space="preserve"> ≠</w:t>
+      </w:r>
+      <w:r>
+        <w:rPr>
+          <w:rFonts w:ascii="Times New Roman" w:hAnsi="Times New Roman" w:cs="Times New Roman"/>
+          <w:sz w:val="28"/>
+          <w:szCs w:val="28"/>
+        </w:rPr>
+        <w:t xml:space="preserve"> 1 для всех найденных простых делителей. Подставляем </w:t>
+      </w:r>
+      <w:proofErr w:type="spellStart"/>
+      <w:r>
+        <w:rPr>
+          <w:rFonts w:ascii="Times New Roman" w:hAnsi="Times New Roman" w:cs="Times New Roman"/>
+          <w:sz w:val="28"/>
+          <w:szCs w:val="28"/>
+        </w:rPr>
+        <w:t>g</w:t>
+      </w:r>
+      <w:proofErr w:type="spellEnd"/>
+      <w:r>
+        <w:rPr>
+          <w:rFonts w:ascii="Times New Roman" w:hAnsi="Times New Roman" w:cs="Times New Roman"/>
+          <w:sz w:val="28"/>
+          <w:szCs w:val="28"/>
+        </w:rPr>
+        <w:t xml:space="preserve"> = 2</w:t>
+      </w:r>
+      <w:r>
+        <w:rPr>
+          <w:rFonts w:ascii="Times New Roman" w:hAnsi="Times New Roman" w:cs="Times New Roman"/>
+          <w:sz w:val="28"/>
+          <w:szCs w:val="28"/>
+        </w:rPr>
+        <w:t>:</w:t>
+      </w:r>
+    </w:p>
+    <w:p>
+      <w:pPr>
+        <w:tabs>
+          <w:tab w:val="left" w:pos="1134"/>
+        </w:tabs>
+        <w:ind w:firstLine="709"/>
+        <w:jc w:val="both"/>
+        <w:rPr>
+          <w:rFonts w:ascii="Times New Roman" w:hAnsi="Times New Roman" w:cs="Times New Roman"/>
+          <w:sz w:val="28"/>
+          <w:szCs w:val="28"/>
+          <w:lang w:val="en-US"/>
+        </w:rPr>
+      </w:pPr>
+      <w:r>
+        <w:rPr>
+          <w:rFonts w:ascii="Times New Roman" w:hAnsi="Times New Roman" w:cs="Times New Roman"/>
+          <w:sz w:val="28"/>
+          <w:szCs w:val="28"/>
+          <w:lang w:val="en-US"/>
+        </w:rPr>
+        <w:t>2</w:t>
+      </w:r>
+      <w:r>
+        <w:rPr>
+          <w:rFonts w:ascii="Times New Roman" w:hAnsi="Times New Roman" w:cs="Times New Roman"/>
+          <w:sz w:val="28"/>
+          <w:szCs w:val="28"/>
+          <w:vertAlign w:val="superscript"/>
+          <w:lang w:val="en-US"/>
+        </w:rPr>
+        <w:t>60/2</w:t>
+      </w:r>
+      <w:r>
+        <w:rPr>
+          <w:rFonts w:ascii="Times New Roman" w:hAnsi="Times New Roman" w:cs="Times New Roman"/>
+          <w:sz w:val="28"/>
+          <w:szCs w:val="28"/>
+          <w:lang w:val="en-US"/>
+        </w:rPr>
+        <w:t xml:space="preserve"> mod 61 = 2</w:t>
+      </w:r>
+      <w:r>
+        <w:rPr>
+          <w:rFonts w:ascii="Times New Roman" w:hAnsi="Times New Roman" w:cs="Times New Roman"/>
+          <w:sz w:val="28"/>
+          <w:szCs w:val="28"/>
+          <w:vertAlign w:val="superscript"/>
+          <w:lang w:val="en-US"/>
+        </w:rPr>
+        <w:t>30</w:t>
+      </w:r>
+      <w:r>
+        <w:rPr>
+          <w:rFonts w:ascii="Times New Roman" w:hAnsi="Times New Roman" w:cs="Times New Roman"/>
+          <w:sz w:val="28"/>
+          <w:szCs w:val="28"/>
+          <w:lang w:val="en-US"/>
+        </w:rPr>
+        <w:t xml:space="preserve"> mod</w:t>
+      </w:r>
+      <w:r>
+        <w:rPr>
+          <w:rFonts w:ascii="Times New Roman" w:hAnsi="Times New Roman" w:cs="Times New Roman"/>
+          <w:sz w:val="28"/>
+          <w:szCs w:val="28"/>
+          <w:lang w:val="en-US"/>
+        </w:rPr>
+        <w:t xml:space="preserve"> </w:t>
+      </w:r>
+      <w:r>
+        <w:rPr>
+          <w:rFonts w:ascii="Times New Roman" w:hAnsi="Times New Roman" w:cs="Times New Roman"/>
+          <w:sz w:val="28"/>
+          <w:szCs w:val="28"/>
+          <w:lang w:val="en-US"/>
+        </w:rPr>
+        <w:t>61 = 60 ≠ 1</w:t>
+      </w:r>
+    </w:p>
+    <w:p>
+      <w:pPr>
+        <w:tabs>
+          <w:tab w:val="left" w:pos="1134"/>
+        </w:tabs>
+        <w:ind w:firstLine="709"/>
+        <w:jc w:val="both"/>
+        <w:rPr>
+          <w:rFonts w:ascii="Times New Roman" w:hAnsi="Times New Roman" w:cs="Times New Roman"/>
+          <w:sz w:val="28"/>
+          <w:szCs w:val="28"/>
+          <w:lang w:val="en-US"/>
+        </w:rPr>
+      </w:pPr>
+      <w:r>
+        <w:rPr>
+          <w:rFonts w:ascii="Times New Roman" w:hAnsi="Times New Roman" w:cs="Times New Roman"/>
+          <w:sz w:val="28"/>
+          <w:szCs w:val="28"/>
+          <w:lang w:val="en-US"/>
+        </w:rPr>
+        <w:t>2</w:t>
+      </w:r>
+      <w:r>
+        <w:rPr>
+          <w:rFonts w:ascii="Times New Roman" w:hAnsi="Times New Roman" w:cs="Times New Roman"/>
+          <w:sz w:val="28"/>
+          <w:szCs w:val="28"/>
+          <w:vertAlign w:val="superscript"/>
+          <w:lang w:val="en-US"/>
+        </w:rPr>
+        <w:t>60/3</w:t>
+      </w:r>
+      <w:r>
+        <w:rPr>
+          <w:rFonts w:ascii="Times New Roman" w:hAnsi="Times New Roman" w:cs="Times New Roman"/>
+          <w:sz w:val="28"/>
+          <w:szCs w:val="28"/>
+          <w:lang w:val="en-US"/>
+        </w:rPr>
+        <w:t xml:space="preserve"> mod 61 = 2</w:t>
+      </w:r>
+      <w:r>
+        <w:rPr>
+          <w:rFonts w:ascii="Times New Roman" w:hAnsi="Times New Roman" w:cs="Times New Roman"/>
+          <w:sz w:val="28"/>
+          <w:szCs w:val="28"/>
+          <w:vertAlign w:val="superscript"/>
+          <w:lang w:val="en-US"/>
+        </w:rPr>
+        <w:t>20</w:t>
+      </w:r>
+      <w:r>
+        <w:rPr>
+          <w:rFonts w:ascii="Times New Roman" w:hAnsi="Times New Roman" w:cs="Times New Roman"/>
+          <w:sz w:val="28"/>
+          <w:szCs w:val="28"/>
+          <w:lang w:val="en-US"/>
+        </w:rPr>
+        <w:t xml:space="preserve"> mod</w:t>
+      </w:r>
+      <w:r>
+        <w:rPr>
+          <w:rFonts w:ascii="Times New Roman" w:hAnsi="Times New Roman" w:cs="Times New Roman"/>
+          <w:sz w:val="28"/>
+          <w:szCs w:val="28"/>
+          <w:lang w:val="en-US"/>
+        </w:rPr>
+        <w:t xml:space="preserve"> </w:t>
+      </w:r>
+      <w:r>
+        <w:rPr>
+          <w:rFonts w:ascii="Times New Roman" w:hAnsi="Times New Roman" w:cs="Times New Roman"/>
+          <w:sz w:val="28"/>
+          <w:szCs w:val="28"/>
+          <w:lang w:val="en-US"/>
+        </w:rPr>
+        <w:t xml:space="preserve">61 = 47 ≠ </w:t>
+      </w:r>
+      <w:r>
+        <w:rPr>
+          <w:rFonts w:ascii="Times New Roman" w:hAnsi="Times New Roman" w:cs="Times New Roman"/>
+          <w:sz w:val="28"/>
+          <w:szCs w:val="28"/>
+          <w:lang w:val="en-US"/>
+        </w:rPr>
+        <w:t>1</w:t>
+      </w:r>
+    </w:p>
+    <w:p>
+      <w:pPr>
+        <w:tabs>
+          <w:tab w:val="left" w:pos="1134"/>
+        </w:tabs>
+        <w:ind w:firstLine="709"/>
+        <w:jc w:val="both"/>
+        <w:rPr>
+          <w:rFonts w:ascii="Times New Roman" w:hAnsi="Times New Roman" w:cs="Times New Roman"/>
+          <w:sz w:val="28"/>
+          <w:szCs w:val="28"/>
+          <w:lang w:val="en-US"/>
+        </w:rPr>
+      </w:pPr>
+      <w:r>
+        <w:rPr>
+          <w:rFonts w:ascii="Times New Roman" w:hAnsi="Times New Roman" w:cs="Times New Roman"/>
+          <w:sz w:val="28"/>
+          <w:szCs w:val="28"/>
+          <w:lang w:val="en-US"/>
+        </w:rPr>
+        <w:t>2</w:t>
+      </w:r>
+      <w:r>
+        <w:rPr>
+          <w:rFonts w:ascii="Times New Roman" w:hAnsi="Times New Roman" w:cs="Times New Roman"/>
+          <w:sz w:val="28"/>
+          <w:szCs w:val="28"/>
+          <w:vertAlign w:val="superscript"/>
+          <w:lang w:val="en-US"/>
+        </w:rPr>
+        <w:t>60/5</w:t>
+      </w:r>
+      <w:r>
+        <w:rPr>
+          <w:rFonts w:ascii="Times New Roman" w:hAnsi="Times New Roman" w:cs="Times New Roman"/>
+          <w:sz w:val="28"/>
+          <w:szCs w:val="28"/>
+          <w:lang w:val="en-US"/>
+        </w:rPr>
+        <w:t xml:space="preserve"> mod</w:t>
+      </w:r>
+      <w:r>
+        <w:rPr>
+          <w:rFonts w:ascii="Times New Roman" w:hAnsi="Times New Roman" w:cs="Times New Roman"/>
+          <w:sz w:val="28"/>
+          <w:szCs w:val="28"/>
+          <w:lang w:val="en-US"/>
+        </w:rPr>
+        <w:t xml:space="preserve"> </w:t>
+      </w:r>
+      <w:r>
+        <w:rPr>
+          <w:rFonts w:ascii="Times New Roman" w:hAnsi="Times New Roman" w:cs="Times New Roman"/>
+          <w:sz w:val="28"/>
+          <w:szCs w:val="28"/>
+          <w:lang w:val="en-US"/>
+        </w:rPr>
+        <w:t>61 = 2</w:t>
+      </w:r>
+      <w:r>
+        <w:rPr>
+          <w:rFonts w:ascii="Times New Roman" w:hAnsi="Times New Roman" w:cs="Times New Roman"/>
+          <w:sz w:val="28"/>
+          <w:szCs w:val="28"/>
+          <w:vertAlign w:val="superscript"/>
+          <w:lang w:val="en-US"/>
+        </w:rPr>
+        <w:t>12</w:t>
+      </w:r>
+      <w:r>
+        <w:rPr>
+          <w:rFonts w:ascii="Times New Roman" w:hAnsi="Times New Roman" w:cs="Times New Roman"/>
+          <w:sz w:val="28"/>
+          <w:szCs w:val="28"/>
+          <w:lang w:val="en-US"/>
+        </w:rPr>
+        <w:t xml:space="preserve"> mod</w:t>
+      </w:r>
+      <w:r>
+        <w:rPr>
+          <w:rFonts w:ascii="Times New Roman" w:hAnsi="Times New Roman" w:cs="Times New Roman"/>
+          <w:sz w:val="28"/>
+          <w:szCs w:val="28"/>
+          <w:lang w:val="en-US"/>
+        </w:rPr>
+        <w:t xml:space="preserve"> </w:t>
+      </w:r>
+      <w:r>
+        <w:rPr>
+          <w:rFonts w:ascii="Times New Roman" w:hAnsi="Times New Roman" w:cs="Times New Roman"/>
+          <w:sz w:val="28"/>
+          <w:szCs w:val="28"/>
+          <w:lang w:val="en-US"/>
+        </w:rPr>
+        <w:t xml:space="preserve">61 = 9 </w:t>
+      </w:r>
+      <w:r>
+        <w:rPr>
+          <w:rFonts w:ascii="Times New Roman" w:hAnsi="Times New Roman" w:cs="Times New Roman"/>
+          <w:sz w:val="28"/>
+          <w:szCs w:val="28"/>
+        </w:rPr>
+        <w:t>≠</w:t>
+      </w:r>
+      <w:r>
+        <w:rPr>
+          <w:rFonts w:ascii="Times New Roman" w:hAnsi="Times New Roman" w:cs="Times New Roman"/>
+          <w:sz w:val="28"/>
+          <w:szCs w:val="28"/>
+          <w:lang w:val="en-US"/>
+        </w:rPr>
+        <w:t xml:space="preserve"> 1</w:t>
+      </w:r>
+    </w:p>
+    <w:p>
+      <w:pPr>
+        <w:tabs>
+          <w:tab w:val="left" w:pos="1134"/>
+        </w:tabs>
+        <w:ind w:firstLine="709"/>
+        <w:jc w:val="both"/>
+        <w:rPr>
+          <w:rFonts w:ascii="Times New Roman" w:hAnsi="Times New Roman" w:cs="Times New Roman"/>
+          <w:sz w:val="28"/>
+          <w:szCs w:val="28"/>
+        </w:rPr>
+      </w:pPr>
+      <w:r>
+        <w:rPr>
+          <w:rFonts w:ascii="Times New Roman" w:hAnsi="Times New Roman" w:cs="Times New Roman"/>
+          <w:sz w:val="28"/>
+          <w:szCs w:val="28"/>
+        </w:rPr>
+        <w:t>Так как ни один из результатов не равен 1, число 2 является первым первообразным корнем по модулю 61.</w:t>
+      </w:r>
+    </w:p>
+    <w:p>
+      <w:pPr>
+        <w:tabs>
+          <w:tab w:val="left" w:pos="1134"/>
+        </w:tabs>
+        <w:ind w:firstLine="709"/>
+        <w:jc w:val="both"/>
+        <w:rPr>
+          <w:rFonts w:ascii="Times New Roman" w:hAnsi="Times New Roman" w:cs="Times New Roman"/>
+          <w:sz w:val="28"/>
+          <w:szCs w:val="28"/>
+        </w:rPr>
+      </w:pPr>
+      <w:r>
+        <w:rPr>
+          <w:rFonts w:ascii="Times New Roman" w:hAnsi="Times New Roman" w:cs="Times New Roman"/>
+          <w:sz w:val="28"/>
+          <w:szCs w:val="28"/>
+        </w:rPr>
+        <w:t>Ищем все остальные первообразные корни:</w:t>
+      </w:r>
+    </w:p>
+    <w:p>
+      <w:pPr>
+        <w:tabs>
+          <w:tab w:val="left" w:pos="1134"/>
+        </w:tabs>
+        <w:ind w:firstLine="709"/>
+        <w:jc w:val="both"/>
+        <w:rPr>
+          <w:rFonts w:ascii="Times New Roman" w:hAnsi="Times New Roman" w:cs="Times New Roman"/>
+          <w:sz w:val="28"/>
+          <w:szCs w:val="28"/>
+        </w:rPr>
+      </w:pPr>
+      <w:r>
+        <w:rPr>
+          <w:rFonts w:ascii="Times New Roman" w:hAnsi="Times New Roman" w:cs="Times New Roman"/>
+          <w:sz w:val="28"/>
+          <w:szCs w:val="28"/>
+        </w:rPr>
+        <w:t xml:space="preserve">Все первообразные корни можно найти по формуле </w:t>
+      </w:r>
+      <w:proofErr w:type="spellStart"/>
+      <w:r>
+        <w:rPr>
+          <w:rFonts w:ascii="Times New Roman" w:hAnsi="Times New Roman" w:cs="Times New Roman"/>
+          <w:sz w:val="28"/>
+          <w:szCs w:val="28"/>
+        </w:rPr>
+        <w:t>g</w:t>
+      </w:r>
+      <w:r>
+        <w:rPr>
+          <w:rFonts w:ascii="Times New Roman" w:hAnsi="Times New Roman" w:cs="Times New Roman"/>
+          <w:sz w:val="28"/>
+          <w:szCs w:val="28"/>
+          <w:vertAlign w:val="superscript"/>
+        </w:rPr>
+        <w:t>k</w:t>
+      </w:r>
+      <w:proofErr w:type="spellEnd"/>
+      <w:r>
+        <w:rPr>
+          <w:rFonts w:ascii="Times New Roman" w:hAnsi="Times New Roman" w:cs="Times New Roman"/>
+          <w:sz w:val="28"/>
+          <w:szCs w:val="28"/>
+        </w:rPr>
+        <w:t xml:space="preserve"> </w:t>
+      </w:r>
+      <w:proofErr w:type="spellStart"/>
+      <w:r>
+        <w:rPr>
+          <w:rFonts w:ascii="Times New Roman" w:hAnsi="Times New Roman" w:cs="Times New Roman"/>
+          <w:sz w:val="28"/>
+          <w:szCs w:val="28"/>
+        </w:rPr>
+        <w:t>mod</w:t>
+      </w:r>
+      <w:proofErr w:type="spellEnd"/>
+      <w:r>
+        <w:rPr>
+          <w:rFonts w:ascii="Times New Roman" w:hAnsi="Times New Roman" w:cs="Times New Roman"/>
+          <w:sz w:val="28"/>
+          <w:szCs w:val="28"/>
+        </w:rPr>
+        <w:t xml:space="preserve"> </w:t>
+      </w:r>
+      <w:proofErr w:type="spellStart"/>
+      <w:r>
+        <w:rPr>
+          <w:rFonts w:ascii="Times New Roman" w:hAnsi="Times New Roman" w:cs="Times New Roman"/>
+          <w:sz w:val="28"/>
+          <w:szCs w:val="28"/>
+        </w:rPr>
+        <w:t>p</w:t>
+      </w:r>
+      <w:proofErr w:type="spellEnd"/>
+      <w:r>
+        <w:rPr>
+          <w:rFonts w:ascii="Times New Roman" w:hAnsi="Times New Roman" w:cs="Times New Roman"/>
+          <w:sz w:val="28"/>
+          <w:szCs w:val="28"/>
+        </w:rPr>
+        <w:t xml:space="preserve">, где </w:t>
+      </w:r>
+      <w:proofErr w:type="spellStart"/>
+      <w:r>
+        <w:rPr>
+          <w:rFonts w:ascii="Times New Roman" w:hAnsi="Times New Roman" w:cs="Times New Roman"/>
+          <w:sz w:val="28"/>
+          <w:szCs w:val="28"/>
+        </w:rPr>
+        <w:t>k</w:t>
+      </w:r>
+      <w:proofErr w:type="spellEnd"/>
+      <w:r>
+        <w:rPr>
+          <w:rFonts w:ascii="Times New Roman" w:hAnsi="Times New Roman" w:cs="Times New Roman"/>
+          <w:sz w:val="28"/>
+          <w:szCs w:val="28"/>
+        </w:rPr>
+        <w:t xml:space="preserve"> и </w:t>
+      </w:r>
+      <w:r>
+        <w:rPr>
+          <w:rFonts w:ascii="Times New Roman" w:hAnsi="Times New Roman" w:cs="Times New Roman"/>
+          <w:sz w:val="28"/>
+          <w:szCs w:val="28"/>
+          <w:lang w:val="en-US"/>
+        </w:rPr>
+        <w:t>phi</w:t>
+      </w:r>
+      <w:r>
+        <w:rPr>
+          <w:rFonts w:ascii="Times New Roman" w:hAnsi="Times New Roman" w:cs="Times New Roman"/>
+          <w:sz w:val="28"/>
+          <w:szCs w:val="28"/>
+        </w:rPr>
+        <w:t>(</w:t>
+      </w:r>
+      <w:proofErr w:type="spellStart"/>
+      <w:r>
+        <w:rPr>
+          <w:rFonts w:ascii="Times New Roman" w:hAnsi="Times New Roman" w:cs="Times New Roman"/>
+          <w:sz w:val="28"/>
+          <w:szCs w:val="28"/>
+        </w:rPr>
+        <w:t>p</w:t>
+      </w:r>
+      <w:proofErr w:type="spellEnd"/>
+      <w:r>
+        <w:rPr>
+          <w:rFonts w:ascii="Times New Roman" w:hAnsi="Times New Roman" w:cs="Times New Roman"/>
+          <w:sz w:val="28"/>
+          <w:szCs w:val="28"/>
+        </w:rPr>
+        <w:t>) взаимно простые.</w:t>
+      </w:r>
+    </w:p>
+    <w:p>
+      <w:pPr>
+        <w:tabs>
+          <w:tab w:val="left" w:pos="1134"/>
+        </w:tabs>
+        <w:ind w:firstLine="709"/>
+        <w:jc w:val="both"/>
+        <w:rPr>
+          <w:rFonts w:ascii="Times New Roman" w:hAnsi="Times New Roman" w:cs="Times New Roman"/>
+          <w:sz w:val="28"/>
+          <w:szCs w:val="28"/>
+        </w:rPr>
+      </w:pPr>
+      <w:r>
+        <w:rPr>
+          <w:rFonts w:ascii="Times New Roman" w:hAnsi="Times New Roman" w:cs="Times New Roman"/>
+          <w:sz w:val="28"/>
+          <w:szCs w:val="28"/>
+        </w:rPr>
+        <w:t>К</w:t>
+      </w:r>
+      <w:r>
+        <w:rPr>
+          <w:rFonts w:ascii="Times New Roman" w:hAnsi="Times New Roman" w:cs="Times New Roman"/>
+          <w:sz w:val="28"/>
+          <w:szCs w:val="28"/>
+        </w:rPr>
+        <w:t xml:space="preserve">оличество таких корней вычисляется как </w:t>
+      </w:r>
+      <w:proofErr w:type="spellStart"/>
+      <w:r>
+        <w:rPr>
+          <w:rFonts w:ascii="Times New Roman" w:hAnsi="Times New Roman" w:cs="Times New Roman"/>
+          <w:sz w:val="28"/>
+          <w:szCs w:val="28"/>
+        </w:rPr>
+        <w:t>phi</w:t>
+      </w:r>
+      <w:proofErr w:type="spellEnd"/>
+      <w:r>
+        <w:rPr>
+          <w:rFonts w:ascii="Times New Roman" w:hAnsi="Times New Roman" w:cs="Times New Roman"/>
+          <w:sz w:val="28"/>
+          <w:szCs w:val="28"/>
+        </w:rPr>
+        <w:t xml:space="preserve">(p-1) = </w:t>
+      </w:r>
+      <w:proofErr w:type="spellStart"/>
+      <w:r>
+        <w:rPr>
+          <w:rFonts w:ascii="Times New Roman" w:hAnsi="Times New Roman" w:cs="Times New Roman"/>
+          <w:sz w:val="28"/>
+          <w:szCs w:val="28"/>
+        </w:rPr>
+        <w:t>phi</w:t>
+      </w:r>
+      <w:proofErr w:type="spellEnd"/>
+      <w:r>
+        <w:rPr>
+          <w:rFonts w:ascii="Times New Roman" w:hAnsi="Times New Roman" w:cs="Times New Roman"/>
+          <w:sz w:val="28"/>
+          <w:szCs w:val="28"/>
+        </w:rPr>
+        <w:t>(60) = 16</w:t>
+      </w:r>
+      <w:r>
+        <w:rPr>
+          <w:rFonts w:ascii="Times New Roman" w:hAnsi="Times New Roman" w:cs="Times New Roman"/>
+          <w:sz w:val="28"/>
+          <w:szCs w:val="28"/>
+        </w:rPr>
+        <w:t>.</w:t>
+      </w:r>
+    </w:p>
+    <w:p>
+      <w:pPr>
+        <w:tabs>
+          <w:tab w:val="left" w:pos="1134"/>
+        </w:tabs>
+        <w:ind w:firstLine="709"/>
+        <w:jc w:val="both"/>
+        <w:rPr>
+          <w:rFonts w:ascii="Times New Roman" w:hAnsi="Times New Roman" w:cs="Times New Roman"/>
+          <w:sz w:val="28"/>
+          <w:szCs w:val="28"/>
+        </w:rPr>
+      </w:pPr>
+      <w:r>
+        <w:rPr>
+          <w:rFonts w:ascii="Times New Roman" w:hAnsi="Times New Roman" w:cs="Times New Roman"/>
+          <w:sz w:val="28"/>
+          <w:szCs w:val="28"/>
+        </w:rPr>
+        <w:t>Выпишем все</w:t>
+      </w:r>
+      <w:r>
+        <w:rPr>
+          <w:rFonts w:ascii="Times New Roman" w:hAnsi="Times New Roman" w:cs="Times New Roman"/>
+          <w:sz w:val="28"/>
+          <w:szCs w:val="28"/>
+        </w:rPr>
+        <w:t xml:space="preserve"> </w:t>
+      </w:r>
+      <w:proofErr w:type="spellStart"/>
+      <w:r>
+        <w:rPr>
+          <w:rFonts w:ascii="Times New Roman" w:hAnsi="Times New Roman" w:cs="Times New Roman"/>
+          <w:sz w:val="28"/>
+          <w:szCs w:val="28"/>
+        </w:rPr>
+        <w:t>k</w:t>
+      </w:r>
+      <w:proofErr w:type="spellEnd"/>
+      <w:r>
+        <w:rPr>
+          <w:rFonts w:ascii="Times New Roman" w:hAnsi="Times New Roman" w:cs="Times New Roman"/>
+          <w:sz w:val="28"/>
+          <w:szCs w:val="28"/>
+        </w:rPr>
+        <w:t xml:space="preserve"> в диапазоне от 1</w:t>
+      </w:r>
+      <w:r>
+        <w:rPr>
+          <w:rFonts w:ascii="Times New Roman" w:hAnsi="Times New Roman" w:cs="Times New Roman"/>
+          <w:sz w:val="28"/>
+          <w:szCs w:val="28"/>
+        </w:rPr>
+        <w:t>..</w:t>
+      </w:r>
+      <w:r>
+        <w:rPr>
+          <w:rFonts w:ascii="Times New Roman" w:hAnsi="Times New Roman" w:cs="Times New Roman"/>
+          <w:sz w:val="28"/>
+          <w:szCs w:val="28"/>
+        </w:rPr>
+        <w:t>59, которые взаимно просты с 60:</w:t>
+      </w:r>
+    </w:p>
+    <w:p>
+      <w:pPr>
+        <w:tabs>
+          <w:tab w:val="left" w:pos="1134"/>
+        </w:tabs>
+        <w:ind w:firstLine="709"/>
+        <w:jc w:val="both"/>
+        <w:rPr>
+          <w:rFonts w:ascii="Times New Roman" w:hAnsi="Times New Roman" w:cs="Times New Roman"/>
+          <w:sz w:val="28"/>
+          <w:szCs w:val="28"/>
+        </w:rPr>
+      </w:pPr>
+      <w:r>
+        <w:rPr>
+          <w:rFonts w:ascii="Times New Roman" w:hAnsi="Times New Roman" w:cs="Times New Roman"/>
+          <w:sz w:val="28"/>
+          <w:szCs w:val="28"/>
+        </w:rPr>
+        <w:t>1, 7, 11, 13, 17, 19, 23, 29, 3</w:t>
+      </w:r>
+      <w:r>
+        <w:rPr>
+          <w:rFonts w:ascii="Times New Roman" w:hAnsi="Times New Roman" w:cs="Times New Roman"/>
+          <w:sz w:val="28"/>
+          <w:szCs w:val="28"/>
+        </w:rPr>
+        <w:t>1, 37, 41, 43, 47, 49, 53, 59</w:t>
+      </w:r>
+      <w:r>
+        <w:rPr>
+          <w:rFonts w:ascii="Times New Roman" w:hAnsi="Times New Roman" w:cs="Times New Roman"/>
+          <w:sz w:val="28"/>
+          <w:szCs w:val="28"/>
+        </w:rPr>
+        <w:t>.</w:t>
+      </w:r>
+    </w:p>
+    <w:p>
+      <w:pPr>
+        <w:tabs>
+          <w:tab w:val="left" w:pos="1134"/>
+        </w:tabs>
+        <w:ind w:firstLine="709"/>
+        <w:jc w:val="both"/>
+        <w:rPr>
+          <w:rFonts w:ascii="Times New Roman" w:hAnsi="Times New Roman" w:cs="Times New Roman"/>
+          <w:sz w:val="28"/>
+          <w:szCs w:val="28"/>
+        </w:rPr>
+      </w:pPr>
+      <w:r>
+        <w:rPr>
+          <w:rFonts w:ascii="Times New Roman" w:hAnsi="Times New Roman" w:cs="Times New Roman"/>
+          <w:sz w:val="28"/>
+          <w:szCs w:val="28"/>
+        </w:rPr>
+        <w:t xml:space="preserve">Теперь возводим корень </w:t>
+      </w:r>
+      <w:r>
+        <w:rPr>
+          <w:rFonts w:ascii="Times New Roman" w:hAnsi="Times New Roman" w:cs="Times New Roman"/>
+          <w:sz w:val="28"/>
+          <w:szCs w:val="28"/>
+        </w:rPr>
+        <w:t>2</w:t>
+      </w:r>
+      <w:r>
+        <w:rPr>
+          <w:rFonts w:ascii="Times New Roman" w:hAnsi="Times New Roman" w:cs="Times New Roman"/>
+          <w:sz w:val="28"/>
+          <w:szCs w:val="28"/>
+        </w:rPr>
+        <w:t xml:space="preserve"> в каждую из этих степеней по модулю 61:</w:t>
+      </w:r>
+    </w:p>
+    <w:p>
+      <w:pPr>
+        <w:tabs>
+          <w:tab w:val="left" w:pos="1134"/>
+        </w:tabs>
+        <w:ind w:firstLine="709"/>
+        <w:jc w:val="both"/>
+        <w:rPr>
+          <w:rFonts w:ascii="Times New Roman" w:hAnsi="Times New Roman" w:cs="Times New Roman"/>
+          <w:sz w:val="28"/>
+          <w:szCs w:val="28"/>
+        </w:rPr>
+      </w:pPr>
+      <w:r>
+        <w:rPr>
+          <w:rFonts w:ascii="Times New Roman" w:hAnsi="Times New Roman" w:cs="Times New Roman"/>
+          <w:sz w:val="28"/>
+          <w:szCs w:val="28"/>
+          <w:lang w:val="en-US"/>
+        </w:rPr>
+        <w:t>k</w:t>
+      </w:r>
+      <w:r>
+        <w:rPr>
+          <w:rFonts w:ascii="Times New Roman" w:hAnsi="Times New Roman" w:cs="Times New Roman"/>
+          <w:sz w:val="28"/>
+          <w:szCs w:val="28"/>
+        </w:rPr>
+        <w:t xml:space="preserve"> = 1:  2</w:t>
+      </w:r>
+      <w:r>
+        <w:rPr>
+          <w:rFonts w:ascii="Times New Roman" w:hAnsi="Times New Roman" w:cs="Times New Roman"/>
+          <w:sz w:val="28"/>
+          <w:szCs w:val="28"/>
+          <w:vertAlign w:val="superscript"/>
+        </w:rPr>
+        <w:t>1</w:t>
+      </w:r>
+      <w:r>
+        <w:rPr>
+          <w:rFonts w:ascii="Times New Roman" w:hAnsi="Times New Roman" w:cs="Times New Roman"/>
+          <w:sz w:val="28"/>
+          <w:szCs w:val="28"/>
+        </w:rPr>
+        <w:t xml:space="preserve"> </w:t>
+      </w:r>
+      <w:r>
+        <w:rPr>
+          <w:rFonts w:ascii="Times New Roman" w:hAnsi="Times New Roman" w:cs="Times New Roman"/>
+          <w:sz w:val="28"/>
+          <w:szCs w:val="28"/>
+          <w:lang w:val="en-US"/>
+        </w:rPr>
+        <w:t>mod</w:t>
+      </w:r>
+      <w:r>
+        <w:rPr>
+          <w:rFonts w:ascii="Times New Roman" w:hAnsi="Times New Roman" w:cs="Times New Roman"/>
+          <w:sz w:val="28"/>
+          <w:szCs w:val="28"/>
+        </w:rPr>
+        <w:t xml:space="preserve"> 61</w:t>
+      </w:r>
+      <w:r>
+        <w:rPr>
+          <w:rFonts w:ascii="Times New Roman" w:hAnsi="Times New Roman" w:cs="Times New Roman"/>
+          <w:sz w:val="28"/>
+          <w:szCs w:val="28"/>
+        </w:rPr>
+        <w:t xml:space="preserve"> = 2</w:t>
+      </w:r>
+    </w:p>
+    <w:p>
+      <w:pPr>
+        <w:tabs>
+          <w:tab w:val="left" w:pos="1134"/>
+        </w:tabs>
+        <w:ind w:firstLine="709"/>
+        <w:jc w:val="both"/>
+        <w:rPr>
+          <w:rFonts w:ascii="Times New Roman" w:hAnsi="Times New Roman" w:cs="Times New Roman"/>
+          <w:sz w:val="28"/>
+          <w:szCs w:val="28"/>
+        </w:rPr>
+      </w:pPr>
+      <w:r>
+        <w:rPr>
+          <w:rFonts w:ascii="Times New Roman" w:hAnsi="Times New Roman" w:cs="Times New Roman"/>
+          <w:sz w:val="28"/>
+          <w:szCs w:val="28"/>
+          <w:lang w:val="en-US"/>
+        </w:rPr>
+        <w:t>k</w:t>
+      </w:r>
+      <w:r>
+        <w:rPr>
+          <w:rFonts w:ascii="Times New Roman" w:hAnsi="Times New Roman" w:cs="Times New Roman"/>
+          <w:sz w:val="28"/>
+          <w:szCs w:val="28"/>
+        </w:rPr>
+        <w:t xml:space="preserve"> = 7:  2</w:t>
+      </w:r>
+      <w:r>
+        <w:rPr>
+          <w:rFonts w:ascii="Times New Roman" w:hAnsi="Times New Roman" w:cs="Times New Roman"/>
+          <w:sz w:val="28"/>
+          <w:szCs w:val="28"/>
+          <w:vertAlign w:val="superscript"/>
+        </w:rPr>
+        <w:t>7</w:t>
+      </w:r>
+      <w:r>
+        <w:rPr>
+          <w:rFonts w:ascii="Times New Roman" w:hAnsi="Times New Roman" w:cs="Times New Roman"/>
+          <w:sz w:val="28"/>
+          <w:szCs w:val="28"/>
+        </w:rPr>
+        <w:t xml:space="preserve"> </w:t>
+      </w:r>
+      <w:r>
+        <w:rPr>
+          <w:rFonts w:ascii="Times New Roman" w:hAnsi="Times New Roman" w:cs="Times New Roman"/>
+          <w:sz w:val="28"/>
+          <w:szCs w:val="28"/>
+          <w:lang w:val="en-US"/>
+        </w:rPr>
+        <w:t>mod</w:t>
+      </w:r>
+      <w:r>
+        <w:rPr>
+          <w:rFonts w:ascii="Times New Roman" w:hAnsi="Times New Roman" w:cs="Times New Roman"/>
+          <w:sz w:val="28"/>
+          <w:szCs w:val="28"/>
+        </w:rPr>
+        <w:t xml:space="preserve"> 61</w:t>
+      </w:r>
+      <w:r>
+        <w:rPr>
+          <w:rFonts w:ascii="Times New Roman" w:hAnsi="Times New Roman" w:cs="Times New Roman"/>
+          <w:sz w:val="28"/>
+          <w:szCs w:val="28"/>
+        </w:rPr>
+        <w:t xml:space="preserve"> = </w:t>
+      </w:r>
+      <w:r>
+        <w:rPr>
+          <w:rFonts w:ascii="Times New Roman" w:hAnsi="Times New Roman" w:cs="Times New Roman"/>
+          <w:sz w:val="28"/>
+          <w:szCs w:val="28"/>
+        </w:rPr>
+        <w:t>6</w:t>
+      </w:r>
+    </w:p>
+    <w:p>
+      <w:pPr>
+        <w:tabs>
+          <w:tab w:val="left" w:pos="1134"/>
+        </w:tabs>
+        <w:ind w:firstLine="709"/>
+        <w:jc w:val="both"/>
+        <w:rPr>
+          <w:rFonts w:ascii="Times New Roman" w:hAnsi="Times New Roman" w:cs="Times New Roman"/>
+          <w:sz w:val="28"/>
+          <w:szCs w:val="28"/>
+        </w:rPr>
+      </w:pPr>
+      <w:proofErr w:type="spellStart"/>
+      <w:r>
+        <w:rPr>
+          <w:rFonts w:ascii="Times New Roman" w:hAnsi="Times New Roman" w:cs="Times New Roman"/>
+          <w:sz w:val="28"/>
+          <w:szCs w:val="28"/>
+        </w:rPr>
+        <w:t>k</w:t>
+      </w:r>
+      <w:proofErr w:type="spellEnd"/>
+      <w:r>
+        <w:rPr>
+          <w:rFonts w:ascii="Times New Roman" w:hAnsi="Times New Roman" w:cs="Times New Roman"/>
+          <w:sz w:val="28"/>
+          <w:szCs w:val="28"/>
+        </w:rPr>
+        <w:t xml:space="preserve"> = 11:</w:t>
+      </w:r>
+      <w:r>
+        <w:rPr>
+          <w:rFonts w:ascii="Times New Roman" w:hAnsi="Times New Roman" w:cs="Times New Roman"/>
+          <w:sz w:val="28"/>
+          <w:szCs w:val="28"/>
+        </w:rPr>
+        <w:t xml:space="preserve"> </w:t>
+      </w:r>
+      <w:r>
+        <w:rPr>
+          <w:rFonts w:ascii="Times New Roman" w:hAnsi="Times New Roman" w:cs="Times New Roman"/>
+          <w:sz w:val="28"/>
+          <w:szCs w:val="28"/>
+        </w:rPr>
+        <w:t xml:space="preserve"> 2</w:t>
+      </w:r>
+      <w:r>
+        <w:rPr>
+          <w:rFonts w:ascii="Times New Roman" w:hAnsi="Times New Roman" w:cs="Times New Roman"/>
+          <w:sz w:val="28"/>
+          <w:szCs w:val="28"/>
+          <w:vertAlign w:val="superscript"/>
+        </w:rPr>
+        <w:t>11</w:t>
+      </w:r>
+      <w:r>
+        <w:rPr>
+          <w:rFonts w:ascii="Times New Roman" w:hAnsi="Times New Roman" w:cs="Times New Roman"/>
+          <w:sz w:val="28"/>
+          <w:szCs w:val="28"/>
+        </w:rPr>
+        <w:t xml:space="preserve"> </w:t>
+      </w:r>
+      <w:proofErr w:type="spellStart"/>
+      <w:r>
+        <w:rPr>
+          <w:rFonts w:ascii="Times New Roman" w:hAnsi="Times New Roman" w:cs="Times New Roman"/>
+          <w:sz w:val="28"/>
+          <w:szCs w:val="28"/>
+        </w:rPr>
+        <w:t>mod</w:t>
+      </w:r>
+      <w:proofErr w:type="spellEnd"/>
+      <w:r>
+        <w:rPr>
+          <w:rFonts w:ascii="Times New Roman" w:hAnsi="Times New Roman" w:cs="Times New Roman"/>
+          <w:sz w:val="28"/>
+          <w:szCs w:val="28"/>
+        </w:rPr>
+        <w:t xml:space="preserve"> </w:t>
+      </w:r>
+      <w:r>
+        <w:rPr>
+          <w:rFonts w:ascii="Times New Roman" w:hAnsi="Times New Roman" w:cs="Times New Roman"/>
+          <w:sz w:val="28"/>
+          <w:szCs w:val="28"/>
+        </w:rPr>
+        <w:t>61</w:t>
+      </w:r>
+      <w:r>
+        <w:rPr>
+          <w:rFonts w:ascii="Times New Roman" w:hAnsi="Times New Roman" w:cs="Times New Roman"/>
+          <w:sz w:val="28"/>
+          <w:szCs w:val="28"/>
+        </w:rPr>
+        <w:t xml:space="preserve"> =</w:t>
+      </w:r>
+      <w:r>
+        <w:rPr>
+          <w:rFonts w:ascii="Times New Roman" w:hAnsi="Times New Roman" w:cs="Times New Roman"/>
+          <w:sz w:val="28"/>
+          <w:szCs w:val="28"/>
+        </w:rPr>
+        <w:t xml:space="preserve"> 35</w:t>
+      </w:r>
+    </w:p>
+    <w:p>
+      <w:pPr>
+        <w:tabs>
+          <w:tab w:val="left" w:pos="1134"/>
+        </w:tabs>
+        <w:ind w:firstLine="709"/>
+        <w:jc w:val="both"/>
+        <w:rPr>
+          <w:rFonts w:ascii="Times New Roman" w:hAnsi="Times New Roman" w:cs="Times New Roman"/>
+          <w:sz w:val="28"/>
+          <w:szCs w:val="28"/>
+        </w:rPr>
+      </w:pPr>
+      <w:r>
+        <w:rPr>
+          <w:rFonts w:ascii="Times New Roman" w:hAnsi="Times New Roman" w:cs="Times New Roman"/>
+          <w:sz w:val="28"/>
+          <w:szCs w:val="28"/>
+          <w:lang w:val="en-US"/>
+        </w:rPr>
+        <w:lastRenderedPageBreak/>
+        <w:t>k</w:t>
+      </w:r>
+      <w:r>
+        <w:rPr>
+          <w:rFonts w:ascii="Times New Roman" w:hAnsi="Times New Roman" w:cs="Times New Roman"/>
+          <w:sz w:val="28"/>
+          <w:szCs w:val="28"/>
+        </w:rPr>
+        <w:t xml:space="preserve"> = 13: </w:t>
+      </w:r>
+      <w:r>
+        <w:rPr>
+          <w:rFonts w:ascii="Times New Roman" w:hAnsi="Times New Roman" w:cs="Times New Roman"/>
+          <w:sz w:val="28"/>
+          <w:szCs w:val="28"/>
+        </w:rPr>
+        <w:t xml:space="preserve"> </w:t>
+      </w:r>
+      <w:r>
+        <w:rPr>
+          <w:rFonts w:ascii="Times New Roman" w:hAnsi="Times New Roman" w:cs="Times New Roman"/>
+          <w:sz w:val="28"/>
+          <w:szCs w:val="28"/>
+        </w:rPr>
+        <w:t xml:space="preserve">213 </w:t>
+      </w:r>
+      <w:r>
+        <w:rPr>
+          <w:rFonts w:ascii="Times New Roman" w:hAnsi="Times New Roman" w:cs="Times New Roman"/>
+          <w:sz w:val="28"/>
+          <w:szCs w:val="28"/>
+          <w:lang w:val="en-US"/>
+        </w:rPr>
+        <w:t>mod</w:t>
+      </w:r>
+      <w:r>
+        <w:rPr>
+          <w:rFonts w:ascii="Times New Roman" w:hAnsi="Times New Roman" w:cs="Times New Roman"/>
+          <w:sz w:val="28"/>
+          <w:szCs w:val="28"/>
+        </w:rPr>
+        <w:t xml:space="preserve"> </w:t>
+      </w:r>
+      <w:r>
+        <w:rPr>
+          <w:rFonts w:ascii="Times New Roman" w:hAnsi="Times New Roman" w:cs="Times New Roman"/>
+          <w:sz w:val="28"/>
+          <w:szCs w:val="28"/>
+        </w:rPr>
+        <w:t>61 = 18</w:t>
+      </w:r>
+    </w:p>
+    <w:p>
+      <w:pPr>
+        <w:tabs>
+          <w:tab w:val="left" w:pos="1134"/>
+        </w:tabs>
+        <w:ind w:firstLine="709"/>
+        <w:jc w:val="both"/>
+        <w:rPr>
+          <w:rFonts w:ascii="Times New Roman" w:hAnsi="Times New Roman" w:cs="Times New Roman"/>
+          <w:sz w:val="28"/>
+          <w:szCs w:val="28"/>
+          <w:lang w:val="en-US"/>
+        </w:rPr>
+      </w:pPr>
+      <w:r>
+        <w:rPr>
+          <w:rFonts w:ascii="Times New Roman" w:hAnsi="Times New Roman" w:cs="Times New Roman"/>
+          <w:sz w:val="28"/>
+          <w:szCs w:val="28"/>
+          <w:lang w:val="en-US"/>
+        </w:rPr>
+        <w:t xml:space="preserve">k = 17: </w:t>
+      </w:r>
+      <w:r>
+        <w:rPr>
+          <w:rFonts w:ascii="Times New Roman" w:hAnsi="Times New Roman" w:cs="Times New Roman"/>
+          <w:sz w:val="28"/>
+          <w:szCs w:val="28"/>
+          <w:lang w:val="en-US"/>
+        </w:rPr>
+        <w:t xml:space="preserve"> </w:t>
+      </w:r>
+      <w:r>
+        <w:rPr>
+          <w:rFonts w:ascii="Times New Roman" w:hAnsi="Times New Roman" w:cs="Times New Roman"/>
+          <w:sz w:val="28"/>
+          <w:szCs w:val="28"/>
+          <w:lang w:val="en-US"/>
+        </w:rPr>
+        <w:t>217 mod</w:t>
+      </w:r>
+      <w:r>
+        <w:rPr>
+          <w:rFonts w:ascii="Times New Roman" w:hAnsi="Times New Roman" w:cs="Times New Roman"/>
+          <w:sz w:val="28"/>
+          <w:szCs w:val="28"/>
+          <w:lang w:val="en-US"/>
+        </w:rPr>
+        <w:t xml:space="preserve"> </w:t>
+      </w:r>
+      <w:r>
+        <w:rPr>
+          <w:rFonts w:ascii="Times New Roman" w:hAnsi="Times New Roman" w:cs="Times New Roman"/>
+          <w:sz w:val="28"/>
+          <w:szCs w:val="28"/>
+          <w:lang w:val="en-US"/>
+        </w:rPr>
+        <w:t>61 = 44</w:t>
+      </w:r>
+    </w:p>
+    <w:p>
+      <w:pPr>
+        <w:tabs>
+          <w:tab w:val="left" w:pos="1134"/>
+        </w:tabs>
+        <w:ind w:firstLine="709"/>
+        <w:jc w:val="both"/>
+        <w:rPr>
+          <w:rFonts w:ascii="Times New Roman" w:hAnsi="Times New Roman" w:cs="Times New Roman"/>
+          <w:sz w:val="28"/>
+          <w:szCs w:val="28"/>
+          <w:lang w:val="en-US"/>
+        </w:rPr>
+      </w:pPr>
+      <w:r>
+        <w:rPr>
+          <w:rFonts w:ascii="Times New Roman" w:hAnsi="Times New Roman" w:cs="Times New Roman"/>
+          <w:sz w:val="28"/>
+          <w:szCs w:val="28"/>
+          <w:lang w:val="en-US"/>
+        </w:rPr>
+        <w:t xml:space="preserve">k = 19: </w:t>
+      </w:r>
+      <w:r>
+        <w:rPr>
+          <w:rFonts w:ascii="Times New Roman" w:hAnsi="Times New Roman" w:cs="Times New Roman"/>
+          <w:sz w:val="28"/>
+          <w:szCs w:val="28"/>
+          <w:lang w:val="en-US"/>
+        </w:rPr>
+        <w:t xml:space="preserve"> </w:t>
+      </w:r>
+      <w:r>
+        <w:rPr>
+          <w:rFonts w:ascii="Times New Roman" w:hAnsi="Times New Roman" w:cs="Times New Roman"/>
+          <w:sz w:val="28"/>
+          <w:szCs w:val="28"/>
+          <w:lang w:val="en-US"/>
+        </w:rPr>
+        <w:t>219 mod</w:t>
+      </w:r>
+      <w:r>
+        <w:rPr>
+          <w:rFonts w:ascii="Times New Roman" w:hAnsi="Times New Roman" w:cs="Times New Roman"/>
+          <w:sz w:val="28"/>
+          <w:szCs w:val="28"/>
+          <w:lang w:val="en-US"/>
+        </w:rPr>
+        <w:t xml:space="preserve"> </w:t>
+      </w:r>
+      <w:r>
+        <w:rPr>
+          <w:rFonts w:ascii="Times New Roman" w:hAnsi="Times New Roman" w:cs="Times New Roman"/>
+          <w:sz w:val="28"/>
+          <w:szCs w:val="28"/>
+          <w:lang w:val="en-US"/>
+        </w:rPr>
+        <w:t>61 = 54</w:t>
+      </w:r>
+    </w:p>
+    <w:p>
+      <w:pPr>
+        <w:tabs>
+          <w:tab w:val="left" w:pos="1134"/>
+        </w:tabs>
+        <w:ind w:firstLine="709"/>
+        <w:jc w:val="both"/>
+        <w:rPr>
+          <w:rFonts w:ascii="Times New Roman" w:hAnsi="Times New Roman" w:cs="Times New Roman"/>
+          <w:sz w:val="28"/>
+          <w:szCs w:val="28"/>
+          <w:lang w:val="en-US"/>
+        </w:rPr>
+      </w:pPr>
+      <w:r>
+        <w:rPr>
+          <w:rFonts w:ascii="Times New Roman" w:hAnsi="Times New Roman" w:cs="Times New Roman"/>
+          <w:sz w:val="28"/>
+          <w:szCs w:val="28"/>
+          <w:lang w:val="en-US"/>
+        </w:rPr>
+        <w:t xml:space="preserve">k = 23: </w:t>
+      </w:r>
+      <w:r>
+        <w:rPr>
+          <w:rFonts w:ascii="Times New Roman" w:hAnsi="Times New Roman" w:cs="Times New Roman"/>
+          <w:sz w:val="28"/>
+          <w:szCs w:val="28"/>
+          <w:lang w:val="en-US"/>
+        </w:rPr>
+        <w:t xml:space="preserve"> </w:t>
+      </w:r>
+      <w:r>
+        <w:rPr>
+          <w:rFonts w:ascii="Times New Roman" w:hAnsi="Times New Roman" w:cs="Times New Roman"/>
+          <w:sz w:val="28"/>
+          <w:szCs w:val="28"/>
+          <w:lang w:val="en-US"/>
+        </w:rPr>
+        <w:t>223 mod</w:t>
+      </w:r>
+      <w:r>
+        <w:rPr>
+          <w:rFonts w:ascii="Times New Roman" w:hAnsi="Times New Roman" w:cs="Times New Roman"/>
+          <w:sz w:val="28"/>
+          <w:szCs w:val="28"/>
+          <w:lang w:val="en-US"/>
+        </w:rPr>
+        <w:t xml:space="preserve"> </w:t>
+      </w:r>
+      <w:r>
+        <w:rPr>
+          <w:rFonts w:ascii="Times New Roman" w:hAnsi="Times New Roman" w:cs="Times New Roman"/>
+          <w:sz w:val="28"/>
+          <w:szCs w:val="28"/>
+          <w:lang w:val="en-US"/>
+        </w:rPr>
+        <w:t>61 = 10</w:t>
+      </w:r>
+    </w:p>
+    <w:p>
+      <w:pPr>
+        <w:tabs>
+          <w:tab w:val="left" w:pos="1134"/>
+        </w:tabs>
+        <w:ind w:firstLine="709"/>
+        <w:jc w:val="both"/>
+        <w:rPr>
+          <w:rFonts w:ascii="Times New Roman" w:hAnsi="Times New Roman" w:cs="Times New Roman"/>
+          <w:sz w:val="28"/>
+          <w:szCs w:val="28"/>
+          <w:lang w:val="en-US"/>
+        </w:rPr>
+      </w:pPr>
+      <w:r>
+        <w:rPr>
+          <w:rFonts w:ascii="Times New Roman" w:hAnsi="Times New Roman" w:cs="Times New Roman"/>
+          <w:sz w:val="28"/>
+          <w:szCs w:val="28"/>
+          <w:lang w:val="en-US"/>
+        </w:rPr>
+        <w:t xml:space="preserve">k = 29: </w:t>
+      </w:r>
+      <w:r>
+        <w:rPr>
+          <w:rFonts w:ascii="Times New Roman" w:hAnsi="Times New Roman" w:cs="Times New Roman"/>
+          <w:sz w:val="28"/>
+          <w:szCs w:val="28"/>
+          <w:lang w:val="en-US"/>
+        </w:rPr>
+        <w:t xml:space="preserve"> </w:t>
+      </w:r>
+      <w:r>
+        <w:rPr>
+          <w:rFonts w:ascii="Times New Roman" w:hAnsi="Times New Roman" w:cs="Times New Roman"/>
+          <w:sz w:val="28"/>
+          <w:szCs w:val="28"/>
+          <w:lang w:val="en-US"/>
+        </w:rPr>
+        <w:t>22</w:t>
+      </w:r>
+      <w:r>
+        <w:rPr>
+          <w:rFonts w:ascii="Times New Roman" w:hAnsi="Times New Roman" w:cs="Times New Roman"/>
+          <w:sz w:val="28"/>
+          <w:szCs w:val="28"/>
+          <w:lang w:val="en-US"/>
+        </w:rPr>
+        <w:t>9 mod</w:t>
+      </w:r>
+      <w:r>
+        <w:rPr>
+          <w:rFonts w:ascii="Times New Roman" w:hAnsi="Times New Roman" w:cs="Times New Roman"/>
+          <w:sz w:val="28"/>
+          <w:szCs w:val="28"/>
+          <w:lang w:val="en-US"/>
+        </w:rPr>
+        <w:t xml:space="preserve"> </w:t>
+      </w:r>
+      <w:r>
+        <w:rPr>
+          <w:rFonts w:ascii="Times New Roman" w:hAnsi="Times New Roman" w:cs="Times New Roman"/>
+          <w:sz w:val="28"/>
+          <w:szCs w:val="28"/>
+          <w:lang w:val="en-US"/>
+        </w:rPr>
+        <w:t xml:space="preserve">61 </w:t>
+      </w:r>
+      <w:r>
+        <w:rPr>
+          <w:rFonts w:ascii="Times New Roman" w:hAnsi="Times New Roman" w:cs="Times New Roman"/>
+          <w:sz w:val="28"/>
+          <w:szCs w:val="28"/>
+          <w:lang w:val="en-US"/>
+        </w:rPr>
+        <w:t>= 30</w:t>
+      </w:r>
+    </w:p>
+    <w:p>
+      <w:pPr>
+        <w:tabs>
+          <w:tab w:val="left" w:pos="1134"/>
+        </w:tabs>
+        <w:ind w:firstLine="709"/>
+        <w:jc w:val="both"/>
+        <w:rPr>
+          <w:rFonts w:ascii="Times New Roman" w:hAnsi="Times New Roman" w:cs="Times New Roman"/>
+          <w:sz w:val="28"/>
+          <w:szCs w:val="28"/>
+          <w:lang w:val="en-US"/>
+        </w:rPr>
+      </w:pPr>
+      <w:r>
+        <w:rPr>
+          <w:rFonts w:ascii="Times New Roman" w:hAnsi="Times New Roman" w:cs="Times New Roman"/>
+          <w:sz w:val="28"/>
+          <w:szCs w:val="28"/>
+          <w:lang w:val="en-US"/>
+        </w:rPr>
+        <w:t xml:space="preserve">k = 31: </w:t>
+      </w:r>
+      <w:r>
+        <w:rPr>
+          <w:rFonts w:ascii="Times New Roman" w:hAnsi="Times New Roman" w:cs="Times New Roman"/>
+          <w:sz w:val="28"/>
+          <w:szCs w:val="28"/>
+          <w:lang w:val="en-US"/>
+        </w:rPr>
+        <w:t xml:space="preserve"> </w:t>
+      </w:r>
+      <w:r>
+        <w:rPr>
+          <w:rFonts w:ascii="Times New Roman" w:hAnsi="Times New Roman" w:cs="Times New Roman"/>
+          <w:sz w:val="28"/>
+          <w:szCs w:val="28"/>
+          <w:lang w:val="en-US"/>
+        </w:rPr>
+        <w:t>231 mod</w:t>
+      </w:r>
+      <w:r>
+        <w:rPr>
+          <w:rFonts w:ascii="Times New Roman" w:hAnsi="Times New Roman" w:cs="Times New Roman"/>
+          <w:sz w:val="28"/>
+          <w:szCs w:val="28"/>
+          <w:lang w:val="en-US"/>
+        </w:rPr>
+        <w:t xml:space="preserve"> </w:t>
+      </w:r>
+      <w:r>
+        <w:rPr>
+          <w:rFonts w:ascii="Times New Roman" w:hAnsi="Times New Roman" w:cs="Times New Roman"/>
+          <w:sz w:val="28"/>
+          <w:szCs w:val="28"/>
+          <w:lang w:val="en-US"/>
+        </w:rPr>
+        <w:t>61 = 59</w:t>
+      </w:r>
+    </w:p>
+    <w:p>
+      <w:pPr>
+        <w:tabs>
+          <w:tab w:val="left" w:pos="1134"/>
+        </w:tabs>
+        <w:ind w:firstLine="709"/>
+        <w:jc w:val="both"/>
+        <w:rPr>
+          <w:rFonts w:ascii="Times New Roman" w:hAnsi="Times New Roman" w:cs="Times New Roman"/>
+          <w:sz w:val="28"/>
+          <w:szCs w:val="28"/>
+          <w:lang w:val="en-US"/>
+        </w:rPr>
+      </w:pPr>
+      <w:r>
+        <w:rPr>
+          <w:rFonts w:ascii="Times New Roman" w:hAnsi="Times New Roman" w:cs="Times New Roman"/>
+          <w:sz w:val="28"/>
+          <w:szCs w:val="28"/>
+          <w:lang w:val="en-US"/>
+        </w:rPr>
+        <w:t>k = 37:</w:t>
+      </w:r>
+      <w:r>
+        <w:rPr>
+          <w:rFonts w:ascii="Times New Roman" w:hAnsi="Times New Roman" w:cs="Times New Roman"/>
+          <w:sz w:val="28"/>
+          <w:szCs w:val="28"/>
+          <w:lang w:val="en-US"/>
+        </w:rPr>
+        <w:t xml:space="preserve">  </w:t>
+      </w:r>
+      <w:r>
+        <w:rPr>
+          <w:rFonts w:ascii="Times New Roman" w:hAnsi="Times New Roman" w:cs="Times New Roman"/>
+          <w:sz w:val="28"/>
+          <w:szCs w:val="28"/>
+          <w:lang w:val="en-US"/>
+        </w:rPr>
+        <w:t>237 mod</w:t>
+      </w:r>
+      <w:r>
+        <w:rPr>
+          <w:rFonts w:ascii="Times New Roman" w:hAnsi="Times New Roman" w:cs="Times New Roman"/>
+          <w:sz w:val="28"/>
+          <w:szCs w:val="28"/>
+          <w:lang w:val="en-US"/>
+        </w:rPr>
+        <w:t xml:space="preserve"> </w:t>
+      </w:r>
+      <w:r>
+        <w:rPr>
+          <w:rFonts w:ascii="Times New Roman" w:hAnsi="Times New Roman" w:cs="Times New Roman"/>
+          <w:sz w:val="28"/>
+          <w:szCs w:val="28"/>
+          <w:lang w:val="en-US"/>
+        </w:rPr>
+        <w:t>61 =</w:t>
+      </w:r>
+      <w:r>
+        <w:rPr>
+          <w:rFonts w:ascii="Times New Roman" w:hAnsi="Times New Roman" w:cs="Times New Roman"/>
+          <w:sz w:val="28"/>
+          <w:szCs w:val="28"/>
+          <w:lang w:val="en-US"/>
+        </w:rPr>
+        <w:t xml:space="preserve"> </w:t>
+      </w:r>
+      <w:r>
+        <w:rPr>
+          <w:rFonts w:ascii="Times New Roman" w:hAnsi="Times New Roman" w:cs="Times New Roman"/>
+          <w:sz w:val="28"/>
+          <w:szCs w:val="28"/>
+          <w:lang w:val="en-US"/>
+        </w:rPr>
+        <w:t>55</w:t>
+      </w:r>
+    </w:p>
+    <w:p>
+      <w:pPr>
+        <w:tabs>
+          <w:tab w:val="left" w:pos="1134"/>
+        </w:tabs>
+        <w:ind w:firstLine="709"/>
+        <w:jc w:val="both"/>
+        <w:rPr>
+          <w:rFonts w:ascii="Times New Roman" w:hAnsi="Times New Roman" w:cs="Times New Roman"/>
+          <w:sz w:val="28"/>
+          <w:szCs w:val="28"/>
+          <w:lang w:val="en-US"/>
+        </w:rPr>
+      </w:pPr>
+      <w:r>
+        <w:rPr>
+          <w:rFonts w:ascii="Times New Roman" w:hAnsi="Times New Roman" w:cs="Times New Roman"/>
+          <w:sz w:val="28"/>
+          <w:szCs w:val="28"/>
+          <w:lang w:val="en-US"/>
+        </w:rPr>
+        <w:t xml:space="preserve">k = 41: </w:t>
+      </w:r>
+      <w:r>
+        <w:rPr>
+          <w:rFonts w:ascii="Times New Roman" w:hAnsi="Times New Roman" w:cs="Times New Roman"/>
+          <w:sz w:val="28"/>
+          <w:szCs w:val="28"/>
+          <w:lang w:val="en-US"/>
+        </w:rPr>
+        <w:t xml:space="preserve"> </w:t>
+      </w:r>
+      <w:r>
+        <w:rPr>
+          <w:rFonts w:ascii="Times New Roman" w:hAnsi="Times New Roman" w:cs="Times New Roman"/>
+          <w:sz w:val="28"/>
+          <w:szCs w:val="28"/>
+          <w:lang w:val="en-US"/>
+        </w:rPr>
+        <w:t>241 mod</w:t>
+      </w:r>
+      <w:r>
+        <w:rPr>
+          <w:rFonts w:ascii="Times New Roman" w:hAnsi="Times New Roman" w:cs="Times New Roman"/>
+          <w:sz w:val="28"/>
+          <w:szCs w:val="28"/>
+          <w:lang w:val="en-US"/>
+        </w:rPr>
+        <w:t xml:space="preserve"> </w:t>
+      </w:r>
+      <w:r>
+        <w:rPr>
+          <w:rFonts w:ascii="Times New Roman" w:hAnsi="Times New Roman" w:cs="Times New Roman"/>
+          <w:sz w:val="28"/>
+          <w:szCs w:val="28"/>
+          <w:lang w:val="en-US"/>
+        </w:rPr>
+        <w:t>61 = 26</w:t>
+      </w:r>
+    </w:p>
+    <w:p>
+      <w:pPr>
+        <w:tabs>
+          <w:tab w:val="left" w:pos="1134"/>
+        </w:tabs>
+        <w:ind w:firstLine="709"/>
+        <w:jc w:val="both"/>
+        <w:rPr>
+          <w:rFonts w:ascii="Times New Roman" w:hAnsi="Times New Roman" w:cs="Times New Roman"/>
+          <w:sz w:val="28"/>
+          <w:szCs w:val="28"/>
+          <w:lang w:val="en-US"/>
+        </w:rPr>
+      </w:pPr>
+      <w:r>
+        <w:rPr>
+          <w:rFonts w:ascii="Times New Roman" w:hAnsi="Times New Roman" w:cs="Times New Roman"/>
+          <w:sz w:val="28"/>
+          <w:szCs w:val="28"/>
+          <w:lang w:val="en-US"/>
+        </w:rPr>
+        <w:t xml:space="preserve">k = 43: </w:t>
+      </w:r>
+      <w:r>
+        <w:rPr>
+          <w:rFonts w:ascii="Times New Roman" w:hAnsi="Times New Roman" w:cs="Times New Roman"/>
+          <w:sz w:val="28"/>
+          <w:szCs w:val="28"/>
+          <w:lang w:val="en-US"/>
+        </w:rPr>
+        <w:t xml:space="preserve"> </w:t>
+      </w:r>
+      <w:r>
+        <w:rPr>
+          <w:rFonts w:ascii="Times New Roman" w:hAnsi="Times New Roman" w:cs="Times New Roman"/>
+          <w:sz w:val="28"/>
+          <w:szCs w:val="28"/>
+          <w:lang w:val="en-US"/>
+        </w:rPr>
+        <w:t>243 mod</w:t>
+      </w:r>
+      <w:r>
+        <w:rPr>
+          <w:rFonts w:ascii="Times New Roman" w:hAnsi="Times New Roman" w:cs="Times New Roman"/>
+          <w:sz w:val="28"/>
+          <w:szCs w:val="28"/>
+          <w:lang w:val="en-US"/>
+        </w:rPr>
+        <w:t xml:space="preserve"> </w:t>
+      </w:r>
+      <w:r>
+        <w:rPr>
+          <w:rFonts w:ascii="Times New Roman" w:hAnsi="Times New Roman" w:cs="Times New Roman"/>
+          <w:sz w:val="28"/>
+          <w:szCs w:val="28"/>
+          <w:lang w:val="en-US"/>
+        </w:rPr>
+        <w:t>61 =</w:t>
+      </w:r>
+      <w:r>
+        <w:rPr>
+          <w:rFonts w:ascii="Times New Roman" w:hAnsi="Times New Roman" w:cs="Times New Roman"/>
+          <w:sz w:val="28"/>
+          <w:szCs w:val="28"/>
+          <w:lang w:val="en-US"/>
+        </w:rPr>
+        <w:t xml:space="preserve"> </w:t>
+      </w:r>
+      <w:r>
+        <w:rPr>
+          <w:rFonts w:ascii="Times New Roman" w:hAnsi="Times New Roman" w:cs="Times New Roman"/>
+          <w:sz w:val="28"/>
+          <w:szCs w:val="28"/>
+          <w:lang w:val="en-US"/>
+        </w:rPr>
+        <w:t>43</w:t>
+      </w:r>
+    </w:p>
+    <w:p>
+      <w:pPr>
+        <w:tabs>
+          <w:tab w:val="left" w:pos="1134"/>
+        </w:tabs>
+        <w:ind w:firstLine="709"/>
+        <w:jc w:val="both"/>
+        <w:rPr>
+          <w:rFonts w:ascii="Times New Roman" w:hAnsi="Times New Roman" w:cs="Times New Roman"/>
+          <w:sz w:val="28"/>
+          <w:szCs w:val="28"/>
+          <w:lang w:val="en-US"/>
+        </w:rPr>
+      </w:pPr>
+      <w:r>
+        <w:rPr>
+          <w:rFonts w:ascii="Times New Roman" w:hAnsi="Times New Roman" w:cs="Times New Roman"/>
+          <w:sz w:val="28"/>
+          <w:szCs w:val="28"/>
+          <w:lang w:val="en-US"/>
+        </w:rPr>
+        <w:t xml:space="preserve">k = 47: </w:t>
+      </w:r>
+      <w:r>
+        <w:rPr>
+          <w:rFonts w:ascii="Times New Roman" w:hAnsi="Times New Roman" w:cs="Times New Roman"/>
+          <w:sz w:val="28"/>
+          <w:szCs w:val="28"/>
+          <w:lang w:val="en-US"/>
+        </w:rPr>
+        <w:t xml:space="preserve"> </w:t>
+      </w:r>
+      <w:r>
+        <w:rPr>
+          <w:rFonts w:ascii="Times New Roman" w:hAnsi="Times New Roman" w:cs="Times New Roman"/>
+          <w:sz w:val="28"/>
+          <w:szCs w:val="28"/>
+          <w:lang w:val="en-US"/>
+        </w:rPr>
+        <w:t>247 mod</w:t>
+      </w:r>
+      <w:r>
+        <w:rPr>
+          <w:rFonts w:ascii="Times New Roman" w:hAnsi="Times New Roman" w:cs="Times New Roman"/>
+          <w:sz w:val="28"/>
+          <w:szCs w:val="28"/>
+          <w:lang w:val="en-US"/>
+        </w:rPr>
+        <w:t xml:space="preserve"> </w:t>
+      </w:r>
+      <w:r>
+        <w:rPr>
+          <w:rFonts w:ascii="Times New Roman" w:hAnsi="Times New Roman" w:cs="Times New Roman"/>
+          <w:sz w:val="28"/>
+          <w:szCs w:val="28"/>
+          <w:lang w:val="en-US"/>
+        </w:rPr>
+        <w:t>61 = 17</w:t>
+      </w:r>
+    </w:p>
+    <w:p>
+      <w:pPr>
+        <w:tabs>
+          <w:tab w:val="left" w:pos="1134"/>
+        </w:tabs>
+        <w:ind w:firstLine="709"/>
+        <w:jc w:val="both"/>
+        <w:rPr>
+          <w:rFonts w:ascii="Times New Roman" w:hAnsi="Times New Roman" w:cs="Times New Roman"/>
+          <w:sz w:val="28"/>
+          <w:szCs w:val="28"/>
+          <w:lang w:val="en-US"/>
+        </w:rPr>
+      </w:pPr>
+      <w:r>
+        <w:rPr>
+          <w:rFonts w:ascii="Times New Roman" w:hAnsi="Times New Roman" w:cs="Times New Roman"/>
+          <w:sz w:val="28"/>
+          <w:szCs w:val="28"/>
+          <w:lang w:val="en-US"/>
+        </w:rPr>
+        <w:t>k = 49:</w:t>
+      </w:r>
+      <w:r>
+        <w:rPr>
+          <w:rFonts w:ascii="Times New Roman" w:hAnsi="Times New Roman" w:cs="Times New Roman"/>
+          <w:sz w:val="28"/>
+          <w:szCs w:val="28"/>
+          <w:lang w:val="en-US"/>
+        </w:rPr>
+        <w:t xml:space="preserve">  </w:t>
+      </w:r>
+      <w:r>
+        <w:rPr>
+          <w:rFonts w:ascii="Times New Roman" w:hAnsi="Times New Roman" w:cs="Times New Roman"/>
+          <w:sz w:val="28"/>
+          <w:szCs w:val="28"/>
+          <w:lang w:val="en-US"/>
+        </w:rPr>
+        <w:t>249 mod</w:t>
+      </w:r>
+      <w:r>
+        <w:rPr>
+          <w:rFonts w:ascii="Times New Roman" w:hAnsi="Times New Roman" w:cs="Times New Roman"/>
+          <w:sz w:val="28"/>
+          <w:szCs w:val="28"/>
+          <w:lang w:val="en-US"/>
+        </w:rPr>
+        <w:t xml:space="preserve"> </w:t>
+      </w:r>
+      <w:r>
+        <w:rPr>
+          <w:rFonts w:ascii="Times New Roman" w:hAnsi="Times New Roman" w:cs="Times New Roman"/>
+          <w:sz w:val="28"/>
+          <w:szCs w:val="28"/>
+          <w:lang w:val="en-US"/>
+        </w:rPr>
+        <w:t>61 = 7</w:t>
+      </w:r>
+    </w:p>
+    <w:p>
+      <w:pPr>
+        <w:tabs>
+          <w:tab w:val="left" w:pos="1134"/>
+        </w:tabs>
+        <w:ind w:firstLine="709"/>
+        <w:jc w:val="both"/>
+        <w:rPr>
+          <w:rFonts w:ascii="Times New Roman" w:hAnsi="Times New Roman" w:cs="Times New Roman"/>
+          <w:sz w:val="28"/>
+          <w:szCs w:val="28"/>
+          <w:lang w:val="en-US"/>
+        </w:rPr>
+      </w:pPr>
+      <w:r>
+        <w:rPr>
+          <w:rFonts w:ascii="Times New Roman" w:hAnsi="Times New Roman" w:cs="Times New Roman"/>
+          <w:sz w:val="28"/>
+          <w:szCs w:val="28"/>
+          <w:lang w:val="en-US"/>
+        </w:rPr>
+        <w:t xml:space="preserve">k = 53: </w:t>
+      </w:r>
+      <w:r>
+        <w:rPr>
+          <w:rFonts w:ascii="Times New Roman" w:hAnsi="Times New Roman" w:cs="Times New Roman"/>
+          <w:sz w:val="28"/>
+          <w:szCs w:val="28"/>
+          <w:lang w:val="en-US"/>
+        </w:rPr>
+        <w:t xml:space="preserve"> </w:t>
+      </w:r>
+      <w:r>
+        <w:rPr>
+          <w:rFonts w:ascii="Times New Roman" w:hAnsi="Times New Roman" w:cs="Times New Roman"/>
+          <w:sz w:val="28"/>
+          <w:szCs w:val="28"/>
+          <w:lang w:val="en-US"/>
+        </w:rPr>
+        <w:t>253 mod</w:t>
+      </w:r>
+      <w:r>
+        <w:rPr>
+          <w:rFonts w:ascii="Times New Roman" w:hAnsi="Times New Roman" w:cs="Times New Roman"/>
+          <w:sz w:val="28"/>
+          <w:szCs w:val="28"/>
+          <w:lang w:val="en-US"/>
+        </w:rPr>
+        <w:t xml:space="preserve"> </w:t>
+      </w:r>
+      <w:r>
+        <w:rPr>
+          <w:rFonts w:ascii="Times New Roman" w:hAnsi="Times New Roman" w:cs="Times New Roman"/>
+          <w:sz w:val="28"/>
+          <w:szCs w:val="28"/>
+          <w:lang w:val="en-US"/>
+        </w:rPr>
+        <w:t xml:space="preserve">61 </w:t>
+      </w:r>
+      <w:r>
+        <w:rPr>
+          <w:rFonts w:ascii="Times New Roman" w:hAnsi="Times New Roman" w:cs="Times New Roman"/>
+          <w:sz w:val="28"/>
+          <w:szCs w:val="28"/>
+          <w:lang w:val="en-US"/>
+        </w:rPr>
+        <w:t xml:space="preserve">= </w:t>
+      </w:r>
+      <w:r>
+        <w:rPr>
+          <w:rFonts w:ascii="Times New Roman" w:hAnsi="Times New Roman" w:cs="Times New Roman"/>
+          <w:sz w:val="28"/>
+          <w:szCs w:val="28"/>
+          <w:lang w:val="en-US"/>
+        </w:rPr>
+        <w:t>51</w:t>
+      </w:r>
+    </w:p>
+    <w:p>
+      <w:pPr>
+        <w:tabs>
+          <w:tab w:val="left" w:pos="1134"/>
+        </w:tabs>
+        <w:ind w:firstLine="709"/>
+        <w:jc w:val="both"/>
+        <w:rPr>
+          <w:rFonts w:ascii="Times New Roman" w:hAnsi="Times New Roman" w:cs="Times New Roman"/>
+          <w:sz w:val="28"/>
+          <w:szCs w:val="28"/>
+          <w:lang w:val="en-US"/>
+        </w:rPr>
+      </w:pPr>
+      <w:r>
+        <w:rPr>
+          <w:rFonts w:ascii="Times New Roman" w:hAnsi="Times New Roman" w:cs="Times New Roman"/>
+          <w:sz w:val="28"/>
+          <w:szCs w:val="28"/>
+          <w:lang w:val="en-US"/>
+        </w:rPr>
+        <w:t xml:space="preserve">k = 59: </w:t>
+      </w:r>
+      <w:r>
+        <w:rPr>
+          <w:rFonts w:ascii="Times New Roman" w:hAnsi="Times New Roman" w:cs="Times New Roman"/>
+          <w:sz w:val="28"/>
+          <w:szCs w:val="28"/>
+          <w:lang w:val="en-US"/>
+        </w:rPr>
+        <w:t xml:space="preserve"> </w:t>
+      </w:r>
+      <w:r>
+        <w:rPr>
+          <w:rFonts w:ascii="Times New Roman" w:hAnsi="Times New Roman" w:cs="Times New Roman"/>
+          <w:sz w:val="28"/>
+          <w:szCs w:val="28"/>
+          <w:lang w:val="en-US"/>
+        </w:rPr>
+        <w:t>259 mod</w:t>
+      </w:r>
+      <w:r>
+        <w:rPr>
+          <w:rFonts w:ascii="Times New Roman" w:hAnsi="Times New Roman" w:cs="Times New Roman"/>
+          <w:sz w:val="28"/>
+          <w:szCs w:val="28"/>
+          <w:lang w:val="en-US"/>
+        </w:rPr>
+        <w:t xml:space="preserve"> </w:t>
+      </w:r>
+      <w:r>
+        <w:rPr>
+          <w:rFonts w:ascii="Times New Roman" w:hAnsi="Times New Roman" w:cs="Times New Roman"/>
+          <w:sz w:val="28"/>
+          <w:szCs w:val="28"/>
+          <w:lang w:val="en-US"/>
+        </w:rPr>
+        <w:t>61 = 31</w:t>
+      </w:r>
+    </w:p>
+    <w:p>
+      <w:pPr>
+        <w:tabs>
+          <w:tab w:val="left" w:pos="1134"/>
+        </w:tabs>
+        <w:ind w:firstLine="709"/>
+        <w:jc w:val="both"/>
+        <w:rPr>
+          <w:rFonts w:ascii="Times New Roman" w:hAnsi="Times New Roman" w:cs="Times New Roman"/>
+          <w:sz w:val="28"/>
+          <w:szCs w:val="28"/>
+          <w:lang w:val="en-US"/>
+        </w:rPr>
+      </w:pPr>
+    </w:p>
+    <w:p>
+      <w:pPr>
+        <w:tabs>
+          <w:tab w:val="left" w:pos="1134"/>
+        </w:tabs>
+        <w:ind w:firstLine="709"/>
+        <w:jc w:val="both"/>
+        <w:rPr>
+          <w:rFonts w:ascii="Times New Roman" w:hAnsi="Times New Roman" w:cs="Times New Roman"/>
+          <w:sz w:val="28"/>
+          <w:szCs w:val="28"/>
+        </w:rPr>
+      </w:pPr>
+      <w:r>
+        <w:rPr>
+          <w:rFonts w:ascii="Times New Roman" w:hAnsi="Times New Roman" w:cs="Times New Roman"/>
+          <w:sz w:val="28"/>
+          <w:szCs w:val="28"/>
+        </w:rPr>
+        <w:t>Все пе</w:t>
+      </w:r>
+      <w:r>
+        <w:rPr>
+          <w:rFonts w:ascii="Times New Roman" w:hAnsi="Times New Roman" w:cs="Times New Roman"/>
+          <w:sz w:val="28"/>
+          <w:szCs w:val="28"/>
+        </w:rPr>
+        <w:t>рвообразные корни по модулю 61:</w:t>
+      </w:r>
+    </w:p>
+    <w:p>
+      <w:pPr>
+        <w:tabs>
+          <w:tab w:val="left" w:pos="1134"/>
+        </w:tabs>
+        <w:ind w:firstLine="709"/>
+        <w:jc w:val="both"/>
+        <w:rPr>
+          <w:rFonts w:ascii="Times New Roman" w:hAnsi="Times New Roman" w:cs="Times New Roman"/>
+          <w:sz w:val="28"/>
+          <w:szCs w:val="28"/>
+          <w:lang w:val="en-US"/>
+        </w:rPr>
+      </w:pPr>
+      <w:r>
+        <w:rPr>
+          <w:rFonts w:ascii="Times New Roman" w:hAnsi="Times New Roman" w:cs="Times New Roman"/>
+          <w:sz w:val="28"/>
+          <w:szCs w:val="28"/>
+        </w:rPr>
+        <w:t>2, 6, 7, 10, 17, 18, 26, 30, 31, 35, 43, 44, 51, 54, 55, 59.</w:t>
+      </w:r>
     </w:p>
     <w:sectPr>
       <w:pgSz w:w="11906" w:h="16838"/>
@@ -2652,7 +5116,7 @@
   <w:abstractNum w:abstractNumId="0">
     <w:nsid w:val="00991741"/>
     <w:multiLevelType w:val="hybridMultilevel"/>
-    <w:tmpl w:val="B28AE044"/>
+    <w:tmpl w:val="05C82B0C"/>
     <w:lvl w:ilvl="0" w:tplc="0419000F">
       <w:start w:val="1"/>
       <w:numFmt w:val="decimal"/>
@@ -2738,8 +5202,312 @@
       </w:pPr>
     </w:lvl>
   </w:abstractNum>
+  <w:abstractNum w:abstractNumId="1">
+    <w:nsid w:val="020A7700"/>
+    <w:multiLevelType w:val="multilevel"/>
+    <w:tmpl w:val="3AC86028"/>
+    <w:lvl w:ilvl="0">
+      <w:start w:val="1"/>
+      <w:numFmt w:val="bullet"/>
+      <w:lvlText w:val=""/>
+      <w:lvlJc w:val="left"/>
+      <w:pPr>
+        <w:tabs>
+          <w:tab w:val="num" w:pos="720"/>
+        </w:tabs>
+        <w:ind w:left="720" w:hanging="360"/>
+      </w:pPr>
+      <w:rPr>
+        <w:rFonts w:ascii="Symbol" w:hAnsi="Symbol" w:hint="default"/>
+        <w:sz w:val="20"/>
+      </w:rPr>
+    </w:lvl>
+    <w:lvl w:ilvl="1" w:tentative="1">
+      <w:start w:val="1"/>
+      <w:numFmt w:val="bullet"/>
+      <w:lvlText w:val="o"/>
+      <w:lvlJc w:val="left"/>
+      <w:pPr>
+        <w:tabs>
+          <w:tab w:val="num" w:pos="1440"/>
+        </w:tabs>
+        <w:ind w:left="1440" w:hanging="360"/>
+      </w:pPr>
+      <w:rPr>
+        <w:rFonts w:ascii="Courier New" w:hAnsi="Courier New" w:hint="default"/>
+        <w:sz w:val="20"/>
+      </w:rPr>
+    </w:lvl>
+    <w:lvl w:ilvl="2" w:tentative="1">
+      <w:start w:val="1"/>
+      <w:numFmt w:val="bullet"/>
+      <w:lvlText w:val=""/>
+      <w:lvlJc w:val="left"/>
+      <w:pPr>
+        <w:tabs>
+          <w:tab w:val="num" w:pos="2160"/>
+        </w:tabs>
+        <w:ind w:left="2160" w:hanging="360"/>
+      </w:pPr>
+      <w:rPr>
+        <w:rFonts w:ascii="Wingdings" w:hAnsi="Wingdings" w:hint="default"/>
+        <w:sz w:val="20"/>
+      </w:rPr>
+    </w:lvl>
+    <w:lvl w:ilvl="3" w:tentative="1">
+      <w:start w:val="1"/>
+      <w:numFmt w:val="bullet"/>
+      <w:lvlText w:val=""/>
+      <w:lvlJc w:val="left"/>
+      <w:pPr>
+        <w:tabs>
+          <w:tab w:val="num" w:pos="2880"/>
+        </w:tabs>
+        <w:ind w:left="2880" w:hanging="360"/>
+      </w:pPr>
+      <w:rPr>
+        <w:rFonts w:ascii="Wingdings" w:hAnsi="Wingdings" w:hint="default"/>
+        <w:sz w:val="20"/>
+      </w:rPr>
+    </w:lvl>
+    <w:lvl w:ilvl="4" w:tentative="1">
+      <w:start w:val="1"/>
+      <w:numFmt w:val="bullet"/>
+      <w:lvlText w:val=""/>
+      <w:lvlJc w:val="left"/>
+      <w:pPr>
+        <w:tabs>
+          <w:tab w:val="num" w:pos="3600"/>
+        </w:tabs>
+        <w:ind w:left="3600" w:hanging="360"/>
+      </w:pPr>
+      <w:rPr>
+        <w:rFonts w:ascii="Wingdings" w:hAnsi="Wingdings" w:hint="default"/>
+        <w:sz w:val="20"/>
+      </w:rPr>
+    </w:lvl>
+    <w:lvl w:ilvl="5" w:tentative="1">
+      <w:start w:val="1"/>
+      <w:numFmt w:val="bullet"/>
+      <w:lvlText w:val=""/>
+      <w:lvlJc w:val="left"/>
+      <w:pPr>
+        <w:tabs>
+          <w:tab w:val="num" w:pos="4320"/>
+        </w:tabs>
+        <w:ind w:left="4320" w:hanging="360"/>
+      </w:pPr>
+      <w:rPr>
+        <w:rFonts w:ascii="Wingdings" w:hAnsi="Wingdings" w:hint="default"/>
+        <w:sz w:val="20"/>
+      </w:rPr>
+    </w:lvl>
+    <w:lvl w:ilvl="6" w:tentative="1">
+      <w:start w:val="1"/>
+      <w:numFmt w:val="bullet"/>
+      <w:lvlText w:val=""/>
+      <w:lvlJc w:val="left"/>
+      <w:pPr>
+        <w:tabs>
+          <w:tab w:val="num" w:pos="5040"/>
+        </w:tabs>
+        <w:ind w:left="5040" w:hanging="360"/>
+      </w:pPr>
+      <w:rPr>
+        <w:rFonts w:ascii="Wingdings" w:hAnsi="Wingdings" w:hint="default"/>
+        <w:sz w:val="20"/>
+      </w:rPr>
+    </w:lvl>
+    <w:lvl w:ilvl="7" w:tentative="1">
+      <w:start w:val="1"/>
+      <w:numFmt w:val="bullet"/>
+      <w:lvlText w:val=""/>
+      <w:lvlJc w:val="left"/>
+      <w:pPr>
+        <w:tabs>
+          <w:tab w:val="num" w:pos="5760"/>
+        </w:tabs>
+        <w:ind w:left="5760" w:hanging="360"/>
+      </w:pPr>
+      <w:rPr>
+        <w:rFonts w:ascii="Wingdings" w:hAnsi="Wingdings" w:hint="default"/>
+        <w:sz w:val="20"/>
+      </w:rPr>
+    </w:lvl>
+    <w:lvl w:ilvl="8" w:tentative="1">
+      <w:start w:val="1"/>
+      <w:numFmt w:val="bullet"/>
+      <w:lvlText w:val=""/>
+      <w:lvlJc w:val="left"/>
+      <w:pPr>
+        <w:tabs>
+          <w:tab w:val="num" w:pos="6480"/>
+        </w:tabs>
+        <w:ind w:left="6480" w:hanging="360"/>
+      </w:pPr>
+      <w:rPr>
+        <w:rFonts w:ascii="Wingdings" w:hAnsi="Wingdings" w:hint="default"/>
+        <w:sz w:val="20"/>
+      </w:rPr>
+    </w:lvl>
+  </w:abstractNum>
+  <w:abstractNum w:abstractNumId="2">
+    <w:nsid w:val="0B0E4883"/>
+    <w:multiLevelType w:val="multilevel"/>
+    <w:tmpl w:val="39FA9FC6"/>
+    <w:lvl w:ilvl="0">
+      <w:start w:val="1"/>
+      <w:numFmt w:val="bullet"/>
+      <w:lvlText w:val=""/>
+      <w:lvlJc w:val="left"/>
+      <w:pPr>
+        <w:tabs>
+          <w:tab w:val="num" w:pos="720"/>
+        </w:tabs>
+        <w:ind w:left="720" w:hanging="360"/>
+      </w:pPr>
+      <w:rPr>
+        <w:rFonts w:ascii="Symbol" w:hAnsi="Symbol" w:hint="default"/>
+        <w:sz w:val="20"/>
+      </w:rPr>
+    </w:lvl>
+    <w:lvl w:ilvl="1" w:tentative="1">
+      <w:start w:val="1"/>
+      <w:numFmt w:val="bullet"/>
+      <w:lvlText w:val="o"/>
+      <w:lvlJc w:val="left"/>
+      <w:pPr>
+        <w:tabs>
+          <w:tab w:val="num" w:pos="1440"/>
+        </w:tabs>
+        <w:ind w:left="1440" w:hanging="360"/>
+      </w:pPr>
+      <w:rPr>
+        <w:rFonts w:ascii="Courier New" w:hAnsi="Courier New" w:hint="default"/>
+        <w:sz w:val="20"/>
+      </w:rPr>
+    </w:lvl>
+    <w:lvl w:ilvl="2" w:tentative="1">
+      <w:start w:val="1"/>
+      <w:numFmt w:val="bullet"/>
+      <w:lvlText w:val=""/>
+      <w:lvlJc w:val="left"/>
+      <w:pPr>
+        <w:tabs>
+          <w:tab w:val="num" w:pos="2160"/>
+        </w:tabs>
+        <w:ind w:left="2160" w:hanging="360"/>
+      </w:pPr>
+      <w:rPr>
+        <w:rFonts w:ascii="Wingdings" w:hAnsi="Wingdings" w:hint="default"/>
+        <w:sz w:val="20"/>
+      </w:rPr>
+    </w:lvl>
+    <w:lvl w:ilvl="3" w:tentative="1">
+      <w:start w:val="1"/>
+      <w:numFmt w:val="bullet"/>
+      <w:lvlText w:val=""/>
+      <w:lvlJc w:val="left"/>
+      <w:pPr>
+        <w:tabs>
+          <w:tab w:val="num" w:pos="2880"/>
+        </w:tabs>
+        <w:ind w:left="2880" w:hanging="360"/>
+      </w:pPr>
+      <w:rPr>
+        <w:rFonts w:ascii="Wingdings" w:hAnsi="Wingdings" w:hint="default"/>
+        <w:sz w:val="20"/>
+      </w:rPr>
+    </w:lvl>
+    <w:lvl w:ilvl="4" w:tentative="1">
+      <w:start w:val="1"/>
+      <w:numFmt w:val="bullet"/>
+      <w:lvlText w:val=""/>
+      <w:lvlJc w:val="left"/>
+      <w:pPr>
+        <w:tabs>
+          <w:tab w:val="num" w:pos="3600"/>
+        </w:tabs>
+        <w:ind w:left="3600" w:hanging="360"/>
+      </w:pPr>
+      <w:rPr>
+        <w:rFonts w:ascii="Wingdings" w:hAnsi="Wingdings" w:hint="default"/>
+        <w:sz w:val="20"/>
+      </w:rPr>
+    </w:lvl>
+    <w:lvl w:ilvl="5" w:tentative="1">
+      <w:start w:val="1"/>
+      <w:numFmt w:val="bullet"/>
+      <w:lvlText w:val=""/>
+      <w:lvlJc w:val="left"/>
+      <w:pPr>
+        <w:tabs>
+          <w:tab w:val="num" w:pos="4320"/>
+        </w:tabs>
+        <w:ind w:left="4320" w:hanging="360"/>
+      </w:pPr>
+      <w:rPr>
+        <w:rFonts w:ascii="Wingdings" w:hAnsi="Wingdings" w:hint="default"/>
+        <w:sz w:val="20"/>
+      </w:rPr>
+    </w:lvl>
+    <w:lvl w:ilvl="6" w:tentative="1">
+      <w:start w:val="1"/>
+      <w:numFmt w:val="bullet"/>
+      <w:lvlText w:val=""/>
+      <w:lvlJc w:val="left"/>
+      <w:pPr>
+        <w:tabs>
+          <w:tab w:val="num" w:pos="5040"/>
+        </w:tabs>
+        <w:ind w:left="5040" w:hanging="360"/>
+      </w:pPr>
+      <w:rPr>
+        <w:rFonts w:ascii="Wingdings" w:hAnsi="Wingdings" w:hint="default"/>
+        <w:sz w:val="20"/>
+      </w:rPr>
+    </w:lvl>
+    <w:lvl w:ilvl="7" w:tentative="1">
+      <w:start w:val="1"/>
+      <w:numFmt w:val="bullet"/>
+      <w:lvlText w:val=""/>
+      <w:lvlJc w:val="left"/>
+      <w:pPr>
+        <w:tabs>
+          <w:tab w:val="num" w:pos="5760"/>
+        </w:tabs>
+        <w:ind w:left="5760" w:hanging="360"/>
+      </w:pPr>
+      <w:rPr>
+        <w:rFonts w:ascii="Wingdings" w:hAnsi="Wingdings" w:hint="default"/>
+        <w:sz w:val="20"/>
+      </w:rPr>
+    </w:lvl>
+    <w:lvl w:ilvl="8" w:tentative="1">
+      <w:start w:val="1"/>
+      <w:numFmt w:val="bullet"/>
+      <w:lvlText w:val=""/>
+      <w:lvlJc w:val="left"/>
+      <w:pPr>
+        <w:tabs>
+          <w:tab w:val="num" w:pos="6480"/>
+        </w:tabs>
+        <w:ind w:left="6480" w:hanging="360"/>
+      </w:pPr>
+      <w:rPr>
+        <w:rFonts w:ascii="Wingdings" w:hAnsi="Wingdings" w:hint="default"/>
+        <w:sz w:val="20"/>
+      </w:rPr>
+    </w:lvl>
+  </w:abstractNum>
   <w:num w:numId="1">
     <w:abstractNumId w:val="0"/>
+  </w:num>
+  <w:num w:numId="2">
+    <w:abstractNumId w:val="2"/>
+  </w:num>
+  <w:num w:numId="3">
+    <w:abstractNumId w:val="1"/>
   </w:num>
 </w:numbering>
 </file>
@@ -2905,6 +5673,26 @@
     <w:qFormat/>
     <w:rsid w:val="00C41F88"/>
   </w:style>
+  <w:style w:type="paragraph" w:styleId="3">
+    <w:name w:val="heading 3"/>
+    <w:basedOn w:val="a"/>
+    <w:link w:val="30"/>
+    <w:uiPriority w:val="9"/>
+    <w:qFormat/>
+    <w:rsid w:val="0063205B"/>
+    <w:pPr>
+      <w:spacing w:before="100" w:beforeAutospacing="1" w:after="100" w:afterAutospacing="1" w:line="240" w:lineRule="auto"/>
+      <w:outlineLvl w:val="2"/>
+    </w:pPr>
+    <w:rPr>
+      <w:rFonts w:ascii="Times New Roman" w:eastAsia="Times New Roman" w:hAnsi="Times New Roman" w:cs="Times New Roman"/>
+      <w:b/>
+      <w:bCs/>
+      <w:sz w:val="27"/>
+      <w:szCs w:val="27"/>
+      <w:lang w:eastAsia="ru-RU"/>
+    </w:rPr>
+  </w:style>
   <w:style w:type="character" w:default="1" w:styleId="a0">
     <w:name w:val="Default Paragraph Font"/>
     <w:uiPriority w:val="1"/>
@@ -2969,6 +5757,54 @@
         <w:right w:w="108" w:type="dxa"/>
       </w:tblCellMar>
     </w:tblPr>
+  </w:style>
+  <w:style w:type="character" w:customStyle="1" w:styleId="30">
+    <w:name w:val="Заголовок 3 Знак"/>
+    <w:basedOn w:val="a0"/>
+    <w:link w:val="3"/>
+    <w:uiPriority w:val="9"/>
+    <w:rsid w:val="0063205B"/>
+    <w:rPr>
+      <w:rFonts w:ascii="Times New Roman" w:eastAsia="Times New Roman" w:hAnsi="Times New Roman" w:cs="Times New Roman"/>
+      <w:b/>
+      <w:bCs/>
+      <w:sz w:val="27"/>
+      <w:szCs w:val="27"/>
+      <w:lang w:eastAsia="ru-RU"/>
+    </w:rPr>
+  </w:style>
+  <w:style w:type="paragraph" w:styleId="a5">
+    <w:name w:val="Normal (Web)"/>
+    <w:basedOn w:val="a"/>
+    <w:uiPriority w:val="99"/>
+    <w:semiHidden/>
+    <w:unhideWhenUsed/>
+    <w:rsid w:val="0063205B"/>
+    <w:pPr>
+      <w:spacing w:before="100" w:beforeAutospacing="1" w:after="100" w:afterAutospacing="1" w:line="240" w:lineRule="auto"/>
+    </w:pPr>
+    <w:rPr>
+      <w:rFonts w:ascii="Times New Roman" w:eastAsia="Times New Roman" w:hAnsi="Times New Roman" w:cs="Times New Roman"/>
+      <w:sz w:val="24"/>
+      <w:szCs w:val="24"/>
+      <w:lang w:eastAsia="ru-RU"/>
+    </w:rPr>
+  </w:style>
+  <w:style w:type="character" w:customStyle="1" w:styleId="math-inline">
+    <w:name w:val="math-inline"/>
+    <w:basedOn w:val="a0"/>
+    <w:rsid w:val="0063205B"/>
+  </w:style>
+  <w:style w:type="character" w:styleId="a6">
+    <w:name w:val="Strong"/>
+    <w:basedOn w:val="a0"/>
+    <w:uiPriority w:val="22"/>
+    <w:qFormat/>
+    <w:rsid w:val="00A5756F"/>
+    <w:rPr>
+      <w:b/>
+      <w:bCs/>
+    </w:rPr>
   </w:style>
 </w:styles>
 </file>

</xml_diff>